<commit_message>
Wrote in the Data Prep part of report and did some needed code clean up
</commit_message>
<xml_diff>
--- a/Assignment1/Assignment 1 Write Up.docx
+++ b/Assignment1/Assignment 1 Write Up.docx
@@ -24,7 +24,41 @@
         <w:pStyle w:val="Heading1"/>
       </w:pPr>
       <w:r>
-        <w:t>Plan &lt;- Delete before submit</w:t>
+        <w:t xml:space="preserve">Data Preparation </w:t>
+      </w:r>
+    </w:p>
+    <w:p>
+      <w:r>
+        <w:t xml:space="preserve">The Dataset provided displays the crashes during a set </w:t>
+      </w:r>
+      <w:r>
+        <w:t>period</w:t>
+      </w:r>
+      <w:r>
+        <w:t xml:space="preserve"> in Victoria. </w:t>
+      </w:r>
+      <w:r>
+        <w:t xml:space="preserve"> After manually analysing the spreadsheet and identifying the most important information needed for analysing, I used the </w:t>
+      </w:r>
+      <w:proofErr w:type="spellStart"/>
+      <w:r>
+        <w:t>pd.read</w:t>
+      </w:r>
+      <w:r>
+        <w:t>_</w:t>
+      </w:r>
+      <w:r>
+        <w:t>csv</w:t>
+      </w:r>
+      <w:proofErr w:type="spellEnd"/>
+      <w:r>
+        <w:t>() to load the crash set into the pandas Data Frame. As I’m using python it is the best way to get the csv data in and be available to be cleansed. In the entire dataset there was 150,</w:t>
+      </w:r>
+      <w:r>
+        <w:t>000</w:t>
+      </w:r>
+      <w:r>
+        <w:t xml:space="preserve"> rows and 52 columns of data. </w:t>
       </w:r>
     </w:p>
     <w:p>
@@ -33,170 +67,199 @@
           <w:b/>
           <w:bCs/>
         </w:rPr>
-        <w:t>Title / Header</w:t>
-      </w:r>
-    </w:p>
-    <w:p>
-      <w:pPr>
-        <w:numPr>
-          <w:ilvl w:val="0"/>
-          <w:numId w:val="1"/>
-        </w:numPr>
-      </w:pPr>
-      <w:r>
-        <w:t>Your name, student ID, date — keep it short, maybe 3-4 lines max</w:t>
-      </w:r>
-    </w:p>
-    <w:p>
-      <w:r>
-        <w:pict w14:anchorId="4F155A16">
-          <v:rect id="_x0000_i1025" style="width:0;height:1.5pt" o:hralign="center" o:hrstd="t" o:hr="t" fillcolor="#a0a0a0" stroked="f"/>
-        </w:pict>
-      </w:r>
-    </w:p>
-    <w:p>
-      <w:r>
+        <w:t>Incorrect Date and Time format</w:t>
+      </w:r>
+      <w:r>
+        <w:t xml:space="preserve">: The ACCIDENT_DATE </w:t>
+      </w:r>
+      <w:r>
+        <w:t xml:space="preserve">and ACCIDENT_TIME columns were stored as raw strings. I used </w:t>
+      </w:r>
+      <w:proofErr w:type="spellStart"/>
+      <w:r>
+        <w:t>parse_date</w:t>
+      </w:r>
+      <w:proofErr w:type="spellEnd"/>
+      <w:r>
+        <w:t xml:space="preserve">() and </w:t>
+      </w:r>
+      <w:proofErr w:type="spellStart"/>
+      <w:r>
+        <w:t>parse_time</w:t>
+      </w:r>
+      <w:proofErr w:type="spellEnd"/>
+      <w:r>
+        <w:t>() with try and except blocks. This allowed for values that couldn’t be parsed to return NaN which stops the script from crashing. ACCIDENT_DATE was converted into a datetime format (DD/MM/YYYY) and ACCIDENT_TIME was converted to a time object (HH:MM:SS) as a result.</w:t>
+      </w:r>
+    </w:p>
+    <w:p>
+      <w:pPr>
         <w:rPr>
           <w:b/>
           <w:bCs/>
         </w:rPr>
-        <w:t>Data Preparation</w:t>
-      </w:r>
-      <w:r>
-        <w:t xml:space="preserve"> </w:t>
-      </w:r>
-    </w:p>
-    <w:p>
-      <w:pPr>
-        <w:numPr>
-          <w:ilvl w:val="0"/>
-          <w:numId w:val="2"/>
-        </w:numPr>
       </w:pPr>
       <w:r>
         <w:rPr>
           <w:b/>
           <w:bCs/>
         </w:rPr>
-        <w:t>Brief intro</w:t>
-      </w:r>
-      <w:r>
-        <w:t xml:space="preserve"> — one sentence on what the dataset is and what cleaning was needed</w:t>
-      </w:r>
-    </w:p>
-    <w:p>
-      <w:pPr>
-        <w:numPr>
-          <w:ilvl w:val="0"/>
-          <w:numId w:val="2"/>
-        </w:numPr>
-      </w:pPr>
+        <w:t xml:space="preserve">Missing Values: </w:t>
+      </w:r>
+    </w:p>
+    <w:p>
       <w:r>
         <w:rPr>
           <w:b/>
           <w:bCs/>
         </w:rPr>
-        <w:t>Missing Values</w:t>
-      </w:r>
-      <w:r>
-        <w:t xml:space="preserve"> — explain dropping SRNS (70% missing), dropping rows with missing lat/long and NO_OF_VEHICLES, filling categorical columns with 'Unknown'</w:t>
-      </w:r>
-    </w:p>
-    <w:p>
-      <w:pPr>
-        <w:numPr>
-          <w:ilvl w:val="0"/>
-          <w:numId w:val="2"/>
-        </w:numPr>
-      </w:pPr>
+        <w:t xml:space="preserve">SRNS: </w:t>
+      </w:r>
+      <w:r>
+        <w:t xml:space="preserve">While checking the dataset a column named SRNS had </w:t>
+      </w:r>
+      <w:r>
+        <w:t>a</w:t>
+      </w:r>
+      <w:r>
+        <w:t xml:space="preserve">round 70% </w:t>
+      </w:r>
+      <w:r>
+        <w:t xml:space="preserve">of missing data </w:t>
+      </w:r>
+      <w:r>
+        <w:t xml:space="preserve">and as there was no reliable way to fill in the missing </w:t>
+      </w:r>
+      <w:r>
+        <w:t>values,</w:t>
+      </w:r>
+      <w:r>
+        <w:t xml:space="preserve"> I </w:t>
+      </w:r>
+      <w:r>
+        <w:t>dropped</w:t>
+      </w:r>
+      <w:r>
+        <w:t xml:space="preserve"> </w:t>
+      </w:r>
+      <w:r>
+        <w:t>the column</w:t>
+      </w:r>
+      <w:r>
+        <w:t xml:space="preserve"> as keeping them or even adding in new values to replace them could be misleading. </w:t>
+      </w:r>
+    </w:p>
+    <w:p>
       <w:r>
         <w:rPr>
           <w:b/>
           <w:bCs/>
         </w:rPr>
-        <w:t>Date &amp; Time Formatting</w:t>
-      </w:r>
-      <w:r>
-        <w:t xml:space="preserve"> — explain converting ACCIDENT_DATE and ACCIDENT_TIME to proper formats</w:t>
-      </w:r>
-    </w:p>
-    <w:p>
-      <w:pPr>
-        <w:numPr>
-          <w:ilvl w:val="0"/>
-          <w:numId w:val="2"/>
-        </w:numPr>
-      </w:pPr>
+        <w:t xml:space="preserve">Dropping Rows: </w:t>
+      </w:r>
+      <w:r>
+        <w:t>LATITUDE, LONGITUDE</w:t>
+      </w:r>
+      <w:r>
+        <w:t xml:space="preserve"> and NO_OF_VEHICLES </w:t>
+      </w:r>
+      <w:r>
+        <w:t>columns</w:t>
+      </w:r>
+      <w:r>
+        <w:t xml:space="preserve"> had a few missing values which in perspective of the dataset shouldn’t </w:t>
+      </w:r>
+      <w:r>
+        <w:t>have</w:t>
+      </w:r>
+      <w:r>
+        <w:t xml:space="preserve"> made a</w:t>
+      </w:r>
+      <w:r>
+        <w:t>n</w:t>
+      </w:r>
+      <w:r>
+        <w:t xml:space="preserve"> </w:t>
+      </w:r>
+      <w:r>
+        <w:t>issue,</w:t>
+      </w:r>
+      <w:r>
+        <w:t xml:space="preserve"> so I dropped them as they are important columns for the analysis and it was minimal how much was truly lost. </w:t>
+      </w:r>
+    </w:p>
+    <w:p>
       <w:r>
         <w:rPr>
           <w:b/>
           <w:bCs/>
         </w:rPr>
-        <w:t>Impossible/Dirty Values</w:t>
-      </w:r>
-      <w:r>
-        <w:t xml:space="preserve"> — explain clean_speed() function, removing 10000km/hr anomalies, zeroes, and unknown speed zones</w:t>
-      </w:r>
-    </w:p>
-    <w:p>
-      <w:pPr>
-        <w:numPr>
-          <w:ilvl w:val="0"/>
-          <w:numId w:val="2"/>
-        </w:numPr>
-      </w:pPr>
+        <w:t xml:space="preserve">Categorical Columns: </w:t>
+      </w:r>
+      <w:r>
+        <w:t xml:space="preserve">some columns like ROAD_NAME, ROAD_TYPE and LGA_NAME had some of the missing values filled in with a unknown as the rows still featured data that was useful to the case finding but it was just that little gap of data. Using the unknown allowed for the data to remain in the set while also outlining there was some missing values. </w:t>
+      </w:r>
+    </w:p>
+    <w:p>
       <w:r>
         <w:rPr>
           <w:b/>
           <w:bCs/>
         </w:rPr>
-        <w:t>Inconsistent Categories</w:t>
-      </w:r>
-      <w:r>
-        <w:t xml:space="preserve"> — explain fixing DAY_OF_WEEK ('Thu', 'Weekend') and LIGHT_CONDITION ('Unk.', 'No', 'Days')</w:t>
-      </w:r>
-    </w:p>
-    <w:p>
-      <w:pPr>
-        <w:numPr>
-          <w:ilvl w:val="0"/>
-          <w:numId w:val="2"/>
-        </w:numPr>
-      </w:pPr>
+        <w:t xml:space="preserve">Redundant Columns: </w:t>
+      </w:r>
+      <w:r>
+        <w:t>The Dataset had VICGRID_X and VICGRID_Y which is the coordinate system but was seen as redundant as we have LATITUDE and LONGITUDE which gives us either more or the same geographic information but allows for other parties to find the places easier. It was mainly dropped so the dataset remained clean and universally correct</w:t>
+      </w:r>
+      <w:r>
+        <w:t>.</w:t>
+      </w:r>
+      <w:r>
+        <w:t xml:space="preserve"> The “errors =’ignore’” line was applied just in case the columns didn’t exist.</w:t>
+      </w:r>
+    </w:p>
+    <w:p>
       <w:r>
         <w:rPr>
           <w:b/>
           <w:bCs/>
         </w:rPr>
-        <w:t>Redundant Columns</w:t>
-      </w:r>
-      <w:r>
-        <w:t xml:space="preserve"> — explain dropping VICGRID_X/Y since lat/long already exists</w:t>
-      </w:r>
-    </w:p>
-    <w:p>
-      <w:pPr>
-        <w:numPr>
-          <w:ilvl w:val="0"/>
-          <w:numId w:val="2"/>
-        </w:numPr>
-      </w:pPr>
+        <w:t xml:space="preserve">Fixing Dirty Categories: </w:t>
+      </w:r>
+      <w:r>
+        <w:t xml:space="preserve">The DAY_OF_WEEK column had some ambiguous and unique values. Thursday was spelled as ‘Thu’ in some entries and ‘Weekend’ which is ambiguous as it could’ve been a Saturday or Sunday. I fixed up these errors by mapping ‘Thu’ to be seen as ‘Thursday’ and ‘Weekend’ to be seen as ‘Saturday’ as Saturday is the first weekend day and it’s safe to assume more people would be out and about than compared to Sunday. If I didn’t fix these issues the heatmap would’ve been incorrect. </w:t>
+      </w:r>
+      <w:r>
+        <w:t>LIGHT_CONDITION had ‘Unk.’ and ‘NO’ correctly mapped to ‘Unknown’ and ‘Days’ were mapped to ‘Day’ which allows it to match the category name</w:t>
+      </w:r>
+    </w:p>
+    <w:p>
       <w:r>
         <w:rPr>
           <w:b/>
           <w:bCs/>
         </w:rPr>
-        <w:t>Type Conversion</w:t>
-      </w:r>
-      <w:r>
-        <w:t xml:space="preserve"> — explain converting vehicle counts from float to int</w:t>
-      </w:r>
-    </w:p>
-    <w:p>
-      <w:r>
-        <w:pict w14:anchorId="012DEBB1">
-          <v:rect id="_x0000_i1026" style="width:0;height:1.5pt" o:hralign="center" o:hrstd="t" o:hr="t" fillcolor="#a0a0a0" stroked="f"/>
-        </w:pict>
+        <w:lastRenderedPageBreak/>
+        <w:t xml:space="preserve">Cleaning SPEED_ZONE: </w:t>
+      </w:r>
+      <w:r>
+        <w:t xml:space="preserve">The SPEED_ZONE column had many errors. It contained a mix of valid speeds, text inputs and values that aren’t possible. </w:t>
+      </w:r>
+      <w:proofErr w:type="spellStart"/>
+      <w:r>
+        <w:t>clean_speed</w:t>
+      </w:r>
+      <w:proofErr w:type="spellEnd"/>
+      <w:r>
+        <w:t>() was a function made to handle to return NaN for missing values, entries that contained either ‘not know’ or ‘other’ and speeds that were over 110km/hr or equal to 0. Filter(</w:t>
+      </w:r>
+      <w:proofErr w:type="spellStart"/>
+      <w:r>
+        <w:t>str.isdigit</w:t>
+      </w:r>
+      <w:proofErr w:type="spellEnd"/>
+      <w:r>
+        <w:t xml:space="preserve">) helped with the extraction of entries that had the km/hr instead of the integer. At the end of this it returned a valid speed and were stored in a column ‘SPEED_ZONE_NUM’ using pandas Int64 which can hold both NaN values and whole numbers whereas regular python int cannot. </w:t>
       </w:r>
     </w:p>
     <w:p>
@@ -205,130 +268,50 @@
           <w:b/>
           <w:bCs/>
         </w:rPr>
-        <w:t>Data Exploration</w:t>
-      </w:r>
-      <w:r>
-        <w:t xml:space="preserve"> </w:t>
-      </w:r>
-    </w:p>
-    <w:p>
-      <w:pPr>
-        <w:numPr>
-          <w:ilvl w:val="0"/>
-          <w:numId w:val="3"/>
-        </w:numPr>
-      </w:pPr>
+        <w:t xml:space="preserve">Type Conversion: </w:t>
+      </w:r>
+      <w:r>
+        <w:t>Vehicle count columns (</w:t>
+      </w:r>
+      <w:r>
+        <w:t>NO_OF_VEHICLES, HEAVYVEHICLE, PASSENGERVEHICLE, MOTORCYCLE, PT_VEHICLE</w:t>
+      </w:r>
+      <w:r>
+        <w:t xml:space="preserve">) were converted from a float to a integer as fractional counts are meaningless. ROAD_ROUTE_1 had its missing values filled with 0 before it was converted into an integer </w:t>
+      </w:r>
+    </w:p>
+    <w:p>
       <w:r>
         <w:rPr>
           <w:b/>
           <w:bCs/>
         </w:rPr>
-        <w:t>Q1</w:t>
-      </w:r>
-      <w:r>
-        <w:t xml:space="preserve"> — explain the heatmap + light condition charts, mention the 3pm school pickup spike finding</w:t>
-      </w:r>
-    </w:p>
-    <w:p>
-      <w:pPr>
-        <w:numPr>
-          <w:ilvl w:val="0"/>
-          <w:numId w:val="3"/>
-        </w:numPr>
-      </w:pPr>
-      <w:r>
-        <w:rPr>
-          <w:b/>
-          <w:bCs/>
-        </w:rPr>
-        <w:t>Q2</w:t>
-      </w:r>
-      <w:r>
-        <w:t xml:space="preserve"> — explain the KDE plot and bar chart, what the speed/injury relationship shows</w:t>
-      </w:r>
-    </w:p>
-    <w:p>
-      <w:pPr>
-        <w:numPr>
-          <w:ilvl w:val="0"/>
-          <w:numId w:val="3"/>
-        </w:numPr>
-      </w:pPr>
-      <w:r>
-        <w:rPr>
-          <w:b/>
-          <w:bCs/>
-        </w:rPr>
-        <w:t>Q3</w:t>
-      </w:r>
-      <w:r>
-        <w:t xml:space="preserve"> — explain top 5 LGAs, the two charts, include the markdown interpretation you already wrote</w:t>
-      </w:r>
-    </w:p>
-    <w:p>
-      <w:r>
-        <w:pict w14:anchorId="59B795C7">
-          <v:rect id="_x0000_i1027" style="width:0;height:1.5pt" o:hralign="center" o:hrstd="t" o:hr="t" fillcolor="#a0a0a0" stroked="f"/>
-        </w:pict>
-      </w:r>
-    </w:p>
-    <w:p>
-      <w:r>
-        <w:rPr>
-          <w:b/>
-          <w:bCs/>
-        </w:rPr>
-        <w:t>References</w:t>
-      </w:r>
-      <w:r>
-        <w:t xml:space="preserve"> </w:t>
-      </w:r>
-      <w:r>
-        <w:rPr>
-          <w:i/>
-          <w:iCs/>
-        </w:rPr>
-        <w:t>(~0.5 page)</w:t>
-      </w:r>
-    </w:p>
-    <w:p>
-      <w:pPr>
-        <w:numPr>
-          <w:ilvl w:val="0"/>
-          <w:numId w:val="4"/>
-        </w:numPr>
-      </w:pPr>
-      <w:r>
-        <w:t>Cite the dataset source from Canvas</w:t>
-      </w:r>
-    </w:p>
-    <w:p/>
+        <w:t xml:space="preserve">Saving Data: </w:t>
+      </w:r>
+      <w:r>
+        <w:t xml:space="preserve">The filtered data was saved to cleaned.csv using </w:t>
+      </w:r>
+      <w:proofErr w:type="spellStart"/>
+      <w:r>
+        <w:t>df.to</w:t>
+      </w:r>
+      <w:r>
+        <w:t>_</w:t>
+      </w:r>
+      <w:r>
+        <w:t>csv</w:t>
+      </w:r>
+      <w:proofErr w:type="spellEnd"/>
+      <w:r>
+        <w:t xml:space="preserve">() with index=False to avoid writing the row numbers as a column. </w:t>
+      </w:r>
+    </w:p>
     <w:p/>
     <w:p>
       <w:pPr>
         <w:pStyle w:val="Heading1"/>
       </w:pPr>
       <w:r>
-        <w:lastRenderedPageBreak/>
-        <w:t xml:space="preserve">Data Preparation </w:t>
-      </w:r>
-    </w:p>
-    <w:p>
-      <w:r>
-        <w:t xml:space="preserve">The Dataset provided displays the crashes during a set period of time in Victoria. I used </w:t>
-      </w:r>
-      <w:r>
-        <w:t xml:space="preserve">some simple cleaning techniques which includes replacing or removing missing values, Proper date and time formatting, fixing </w:t>
-      </w:r>
-      <w:r>
-        <w:t>values that could be seen as outliers, inconsistent catergaories, redundant colimns and changing some type conversion</w:t>
-      </w:r>
-    </w:p>
-    <w:p>
-      <w:pPr>
-        <w:pStyle w:val="Heading1"/>
-      </w:pPr>
-      <w:r>
         <w:t>Data Exploration</w:t>
       </w:r>
     </w:p>
@@ -339,14 +322,11 @@
     </w:p>
     <w:p>
       <w:r>
-        <w:rPr>
-          <w:noProof/>
-        </w:rPr>
         <w:drawing>
-          <wp:inline distT="0" distB="0" distL="0" distR="0" wp14:anchorId="75112071" wp14:editId="2D70E6E8">
-            <wp:extent cx="5731510" cy="2032000"/>
-            <wp:effectExtent l="0" t="0" r="2540" b="6350"/>
-            <wp:docPr id="1795462919" name="Picture 1"/>
+          <wp:inline distT="0" distB="0" distL="0" distR="0" wp14:anchorId="1F6D3BF2" wp14:editId="3685F636">
+            <wp:extent cx="5731510" cy="1786890"/>
+            <wp:effectExtent l="0" t="0" r="2540" b="3810"/>
+            <wp:docPr id="1012169669" name="Picture 1"/>
             <wp:cNvGraphicFramePr>
               <a:graphicFrameLocks xmlns:a="http://schemas.openxmlformats.org/drawingml/2006/main" noChangeAspect="1"/>
             </wp:cNvGraphicFramePr>
@@ -354,7 +334,7 @@
               <a:graphicData uri="http://schemas.openxmlformats.org/drawingml/2006/picture">
                 <pic:pic xmlns:pic="http://schemas.openxmlformats.org/drawingml/2006/picture">
                   <pic:nvPicPr>
-                    <pic:cNvPr id="1795462919" name=""/>
+                    <pic:cNvPr id="1012169669" name=""/>
                     <pic:cNvPicPr/>
                   </pic:nvPicPr>
                   <pic:blipFill>
@@ -366,7 +346,7 @@
                   <pic:spPr>
                     <a:xfrm>
                       <a:off x="0" y="0"/>
-                      <a:ext cx="5731510" cy="2032000"/>
+                      <a:ext cx="5731510" cy="1786890"/>
                     </a:xfrm>
                     <a:prstGeom prst="rect">
                       <a:avLst/>
@@ -426,6 +406,7 @@
         <w:rPr>
           <w:noProof/>
         </w:rPr>
+        <w:lastRenderedPageBreak/>
         <w:drawing>
           <wp:inline distT="0" distB="0" distL="0" distR="0" wp14:anchorId="4C765F90" wp14:editId="0909C4D2">
             <wp:extent cx="5731510" cy="1826260"/>
@@ -476,7 +457,6 @@
         <w:rPr>
           <w:noProof/>
         </w:rPr>
-        <w:lastRenderedPageBreak/>
         <w:drawing>
           <wp:inline distT="0" distB="0" distL="0" distR="0" wp14:anchorId="2331DCA4" wp14:editId="21919FDF">
             <wp:extent cx="5731510" cy="3636645"/>
@@ -519,6 +499,7 @@
         <w:rPr>
           <w:noProof/>
         </w:rPr>
+        <w:lastRenderedPageBreak/>
         <w:drawing>
           <wp:inline distT="0" distB="0" distL="0" distR="0" wp14:anchorId="31AF754B" wp14:editId="6E64927B">
             <wp:extent cx="5731510" cy="3653155"/>
@@ -569,7 +550,6 @@
         <w:rPr>
           <w:noProof/>
         </w:rPr>
-        <w:lastRenderedPageBreak/>
         <w:drawing>
           <wp:inline distT="0" distB="0" distL="0" distR="0" wp14:anchorId="4CC07BB6" wp14:editId="0A000990">
             <wp:extent cx="5731510" cy="2578735"/>
@@ -612,6 +592,7 @@
         <w:rPr>
           <w:noProof/>
         </w:rPr>
+        <w:lastRenderedPageBreak/>
         <w:drawing>
           <wp:inline distT="0" distB="0" distL="0" distR="0" wp14:anchorId="293814EF" wp14:editId="16D8CA50">
             <wp:extent cx="5731510" cy="2588260"/>
@@ -662,6 +643,387 @@
       </w:r>
     </w:p>
     <w:p/>
+    <w:p/>
+    <w:p/>
+    <w:p/>
+    <w:p/>
+    <w:p/>
+    <w:p/>
+    <w:p/>
+    <w:p/>
+    <w:p/>
+    <w:p/>
+    <w:p/>
+    <w:p/>
+    <w:p/>
+    <w:p/>
+    <w:p/>
+    <w:p/>
+    <w:p/>
+    <w:p/>
+    <w:p/>
+    <w:p/>
+    <w:p/>
+    <w:p/>
+    <w:p/>
+    <w:p/>
+    <w:p>
+      <w:r>
+        <w:rPr>
+          <w:b/>
+          <w:bCs/>
+        </w:rPr>
+        <w:t>DATA EXPLORATION</w:t>
+      </w:r>
+    </w:p>
+    <w:p>
+      <w:r>
+        <w:rPr>
+          <w:b/>
+          <w:bCs/>
+        </w:rPr>
+        <w:t>Q1 — Accident Frequencies by Day, Hour and Light Condition (2023)</w:t>
+      </w:r>
+    </w:p>
+    <w:p>
+      <w:r>
+        <w:t xml:space="preserve">The data was first filtered to 2023 only. The ACCIDENT_TIME column was re-parsed using </w:t>
+      </w:r>
+      <w:proofErr w:type="spellStart"/>
+      <w:r>
+        <w:t>pd.to_datetime</w:t>
+      </w:r>
+      <w:proofErr w:type="spellEnd"/>
+      <w:r>
+        <w:t>() to allow extraction of the hour via .</w:t>
+      </w:r>
+      <w:proofErr w:type="spellStart"/>
+      <w:r>
+        <w:t>dt.hour</w:t>
+      </w:r>
+      <w:proofErr w:type="spellEnd"/>
+      <w:r>
+        <w:t xml:space="preserve"> — this was necessary because the time object format from Task 1 doesn't support .dt accessor directly.</w:t>
+      </w:r>
+    </w:p>
+    <w:p>
+      <w:r>
+        <w:rPr>
+          <w:i/>
+          <w:iCs/>
+        </w:rPr>
+        <w:t>Chart 1 — Heatmap:</w:t>
+      </w:r>
+      <w:r>
+        <w:t xml:space="preserve"> Accidents were grouped by DAY_OF_WEEK and HOUR and counted. Days were reindexed in correct order (Monday to Sunday). Hour labels were converted to 12-hour AM/PM format for readability. The heatmap uses a </w:t>
+      </w:r>
+      <w:proofErr w:type="spellStart"/>
+      <w:r>
+        <w:t>YlOrRd</w:t>
+      </w:r>
+      <w:proofErr w:type="spellEnd"/>
+      <w:r>
+        <w:t xml:space="preserve"> colour scale where darker red indicates more accidents. Key finding: the peak accident time is </w:t>
+      </w:r>
+      <w:r>
+        <w:rPr>
+          <w:b/>
+          <w:bCs/>
+        </w:rPr>
+        <w:t>3pm on weekdays</w:t>
+      </w:r>
+      <w:r>
+        <w:t xml:space="preserve"> corresponding to school pickup time, not traditional rush hour. Friday and Saturday nights also show elevated activity.</w:t>
+      </w:r>
+    </w:p>
+    <w:p>
+      <w:r>
+        <w:rPr>
+          <w:i/>
+          <w:iCs/>
+        </w:rPr>
+        <w:t>Chart 2 — Line Chart:</w:t>
+      </w:r>
+      <w:r>
+        <w:t xml:space="preserve"> Accidents were grouped by hour and light condition and plotted as a line chart with markers. This shows how each lighting condition contributes to accidents across the day. Key finding: daytime accidents dominate in raw numbers due to traffic volume, but dark conditions without street lighting show disproportionate risk relative to the amount of traffic present at those hours.</w:t>
+      </w:r>
+    </w:p>
+    <w:p>
+      <w:r>
+        <w:rPr>
+          <w:i/>
+          <w:iCs/>
+        </w:rPr>
+        <w:t>Chart 3 — Stacked Bar Chart:</w:t>
+      </w:r>
+      <w:r>
+        <w:t xml:space="preserve"> Accidents were grouped by day of week and light condition, converted to percentages of the daily total, and plotted as a stacked bar chart. This reveals that weekends have a higher proportion of dark condition accidents compared to weekdays, suggesting compounding risk factors such as alcohol, fatigue and reduced visibility on weekend nights.</w:t>
+      </w:r>
+    </w:p>
+    <w:p>
+      <w:r>
+        <w:pict w14:anchorId="658133B8">
+          <v:rect id="_x0000_i1043" style="width:0;height:1.5pt" o:hralign="center" o:hrstd="t" o:hr="t" fillcolor="#a0a0a0" stroked="f"/>
+        </w:pict>
+      </w:r>
+    </w:p>
+    <w:p>
+      <w:r>
+        <w:rPr>
+          <w:b/>
+          <w:bCs/>
+        </w:rPr>
+        <w:t>Q2 — Speed Zone vs Number of Victims</w:t>
+      </w:r>
+    </w:p>
+    <w:p>
+      <w:r>
+        <w:rPr>
+          <w:i/>
+          <w:iCs/>
+        </w:rPr>
+        <w:t>Chart 1 — KDE Plot:</w:t>
+      </w:r>
+      <w:r>
+        <w:t xml:space="preserve"> The data was filtered to 'Serious injury accident' and 'Other injury accident' severity types only. A KDE (Kernel Density Estimation) plot was used to compare the distribution of speed zones between the two severity categories. KDE was chosen over a histogram because it shows the shape of the distribution as a smooth curve, making it easier to compare two groups visually. </w:t>
+      </w:r>
+      <w:proofErr w:type="spellStart"/>
+      <w:r>
+        <w:t>common_norm</w:t>
+      </w:r>
+      <w:proofErr w:type="spellEnd"/>
+      <w:r>
+        <w:t>=False was used so each curve is normalised independently, allowing fair comparison regardless of group size.</w:t>
+      </w:r>
+    </w:p>
+    <w:p>
+      <w:r>
+        <w:rPr>
+          <w:i/>
+          <w:iCs/>
+        </w:rPr>
+        <w:lastRenderedPageBreak/>
+        <w:t>Chart 2 — Bar Chart:</w:t>
+      </w:r>
+      <w:r>
+        <w:t xml:space="preserve"> The average number of victims (INJ_OR_FATAL) per accident was calculated for each speed zone using </w:t>
+      </w:r>
+      <w:proofErr w:type="spellStart"/>
+      <w:r>
+        <w:t>np.mean</w:t>
+      </w:r>
+      <w:proofErr w:type="spellEnd"/>
+      <w:r>
+        <w:t xml:space="preserve"> as the estimator in </w:t>
+      </w:r>
+      <w:proofErr w:type="spellStart"/>
+      <w:r>
+        <w:t>seaborn's</w:t>
+      </w:r>
+      <w:proofErr w:type="spellEnd"/>
+      <w:r>
+        <w:t xml:space="preserve"> </w:t>
+      </w:r>
+      <w:proofErr w:type="spellStart"/>
+      <w:r>
+        <w:t>barplot</w:t>
+      </w:r>
+      <w:proofErr w:type="spellEnd"/>
+      <w:r>
+        <w:t>. This directly answers whether higher speed zones lead to more victims per accident. Key finding: higher speed zones correlate with more victims per accident, consistent with the known relationship between vehicle speed and crash severity.</w:t>
+      </w:r>
+    </w:p>
+    <w:p>
+      <w:r>
+        <w:pict w14:anchorId="28AA194C">
+          <v:rect id="_x0000_i1044" style="width:0;height:1.5pt" o:hralign="center" o:hrstd="t" o:hr="t" fillcolor="#a0a0a0" stroked="f"/>
+        </w:pict>
+      </w:r>
+    </w:p>
+    <w:p>
+      <w:r>
+        <w:rPr>
+          <w:b/>
+          <w:bCs/>
+        </w:rPr>
+        <w:t>Q3 — Crash Distribution by Geographic Area</w:t>
+      </w:r>
+    </w:p>
+    <w:p>
+      <w:r>
+        <w:rPr>
+          <w:i/>
+          <w:iCs/>
+        </w:rPr>
+        <w:t>Identifying Top 5 LGAs:</w:t>
+      </w:r>
+      <w:r>
+        <w:t xml:space="preserve"> </w:t>
+      </w:r>
+      <w:proofErr w:type="spellStart"/>
+      <w:r>
+        <w:t>value_counts</w:t>
+      </w:r>
+      <w:proofErr w:type="spellEnd"/>
+      <w:r>
+        <w:t>() was used on LGA_NAME and .</w:t>
+      </w:r>
+      <w:proofErr w:type="spellStart"/>
+      <w:r>
+        <w:t>nlargest</w:t>
+      </w:r>
+      <w:proofErr w:type="spellEnd"/>
+      <w:r>
+        <w:t>(5) selected the five Local Government Areas with the highest total accident counts. The dataset was then filtered to only those five LGAs.</w:t>
+      </w:r>
+    </w:p>
+    <w:p>
+      <w:r>
+        <w:rPr>
+          <w:i/>
+          <w:iCs/>
+        </w:rPr>
+        <w:t>Chart 1 — Boxplot (Speed Zone Distribution):</w:t>
+      </w:r>
+      <w:r>
+        <w:t xml:space="preserve"> A boxplot was created showing the distribution of SPEED_ZONE_NUM for each of the top 5 LGAs. Boxplots were chosen because they show the median, interquartile range, and outliers simultaneously, revealing differences in road infrastructure across LGAs. Some LGAs show a wider spread indicating a mix of suburban and high-speed arterial roads, while others cluster tightly around lower urban speed limits.</w:t>
+      </w:r>
+    </w:p>
+    <w:p>
+      <w:r>
+        <w:rPr>
+          <w:i/>
+          <w:iCs/>
+        </w:rPr>
+        <w:t>Chart 2 — Stacked Bar Chart (Severity Breakdown):</w:t>
+      </w:r>
+      <w:r>
+        <w:t xml:space="preserve"> Accidents were grouped by LGA and severity type, converted to percentages of each LGA's total, and plotted as a stacked bar chart. Key finding: despite having high accident volumes, some LGAs maintain lower proportions of serious/fatal crashes, likely due to lower speed environments. LGAs with more high-speed zone accidents tend to show higher serious injury rates.</w:t>
+      </w:r>
+    </w:p>
+    <w:p/>
+    <w:p/>
+    <w:p/>
+    <w:p/>
+    <w:p/>
+    <w:p/>
+    <w:p/>
+    <w:p/>
+    <w:p/>
+    <w:p/>
+    <w:p/>
+    <w:p/>
+    <w:p/>
+    <w:p>
+      <w:pPr>
+        <w:rPr>
+          <w:b/>
+          <w:bCs/>
+        </w:rPr>
+      </w:pPr>
+    </w:p>
+    <w:p>
+      <w:r>
+        <w:rPr>
+          <w:b/>
+          <w:bCs/>
+        </w:rPr>
+        <w:t xml:space="preserve">References: </w:t>
+      </w:r>
+    </w:p>
+    <w:p>
+      <w:r>
+        <w:lastRenderedPageBreak/>
+        <w:t xml:space="preserve">The pandas development team. (2024). </w:t>
+      </w:r>
+      <w:r>
+        <w:rPr>
+          <w:i/>
+          <w:iCs/>
+        </w:rPr>
+        <w:t>pandas documentation</w:t>
+      </w:r>
+      <w:r>
+        <w:t xml:space="preserve">. </w:t>
+      </w:r>
+      <w:hyperlink r:id="rId12" w:history="1">
+        <w:r>
+          <w:rPr>
+            <w:rStyle w:val="Hyperlink"/>
+          </w:rPr>
+          <w:t>https://pandas.pydata.org/docs/</w:t>
+        </w:r>
+      </w:hyperlink>
+    </w:p>
+    <w:p>
+      <w:r>
+        <w:t xml:space="preserve">Harris, C. R., Millman, K. J., van der Walt, S. J., et al. (2020). Array programming with NumPy. </w:t>
+      </w:r>
+      <w:r>
+        <w:rPr>
+          <w:i/>
+          <w:iCs/>
+        </w:rPr>
+        <w:t>Nature, 585</w:t>
+      </w:r>
+      <w:r>
+        <w:t xml:space="preserve">, 357–362. </w:t>
+      </w:r>
+      <w:hyperlink r:id="rId13" w:history="1">
+        <w:r>
+          <w:rPr>
+            <w:rStyle w:val="Hyperlink"/>
+          </w:rPr>
+          <w:t>https://doi.org/10.1038/s41586-020-2649-2</w:t>
+        </w:r>
+      </w:hyperlink>
+    </w:p>
+    <w:p>
+      <w:r>
+        <w:t xml:space="preserve">Hunter, J. D. (2007). Matplotlib: A 2D graphics environment. </w:t>
+      </w:r>
+      <w:r>
+        <w:rPr>
+          <w:i/>
+          <w:iCs/>
+        </w:rPr>
+        <w:t>Computing in Science &amp; Engineering, 9</w:t>
+      </w:r>
+      <w:r>
+        <w:t xml:space="preserve">(3), 90–95. </w:t>
+      </w:r>
+      <w:hyperlink r:id="rId14" w:history="1">
+        <w:r>
+          <w:rPr>
+            <w:rStyle w:val="Hyperlink"/>
+          </w:rPr>
+          <w:t>https://doi.org/10.1109/MCSE.2007.55</w:t>
+        </w:r>
+      </w:hyperlink>
+    </w:p>
+    <w:p>
+      <w:r>
+        <w:t xml:space="preserve">Waskom, M. L. (2021). seaborn: Statistical data visualization. </w:t>
+      </w:r>
+      <w:r>
+        <w:rPr>
+          <w:i/>
+          <w:iCs/>
+        </w:rPr>
+        <w:t>Journal of Open Source Software, 6</w:t>
+      </w:r>
+      <w:r>
+        <w:t xml:space="preserve">(60), 3021. </w:t>
+      </w:r>
+      <w:hyperlink r:id="rId15" w:history="1">
+        <w:r>
+          <w:rPr>
+            <w:rStyle w:val="Hyperlink"/>
+          </w:rPr>
+          <w:t>https://doi.org/10.21105/joss.03021</w:t>
+        </w:r>
+      </w:hyperlink>
+    </w:p>
     <w:sectPr>
       <w:pgSz w:w="11906" w:h="16838"/>
       <w:pgMar w:top="1440" w:right="1440" w:bottom="1440" w:left="1440" w:header="708" w:footer="708" w:gutter="0"/>
@@ -1888,7 +2250,6 @@
   <w:style w:type="character" w:default="1" w:styleId="DefaultParagraphFont">
     <w:name w:val="Default Paragraph Font"/>
     <w:uiPriority w:val="1"/>
-    <w:semiHidden/>
     <w:unhideWhenUsed/>
   </w:style>
   <w:style w:type="table" w:default="1" w:styleId="TableNormal">
@@ -2200,6 +2561,29 @@
       <w:smallCaps/>
       <w:color w:val="0F4761" w:themeColor="accent1" w:themeShade="BF"/>
       <w:spacing w:val="5"/>
+    </w:rPr>
+  </w:style>
+  <w:style w:type="character" w:styleId="Hyperlink">
+    <w:name w:val="Hyperlink"/>
+    <w:basedOn w:val="DefaultParagraphFont"/>
+    <w:uiPriority w:val="99"/>
+    <w:unhideWhenUsed/>
+    <w:rsid w:val="00401D2E"/>
+    <w:rPr>
+      <w:color w:val="467886" w:themeColor="hyperlink"/>
+      <w:u w:val="single"/>
+    </w:rPr>
+  </w:style>
+  <w:style w:type="character" w:styleId="UnresolvedMention">
+    <w:name w:val="Unresolved Mention"/>
+    <w:basedOn w:val="DefaultParagraphFont"/>
+    <w:uiPriority w:val="99"/>
+    <w:semiHidden/>
+    <w:unhideWhenUsed/>
+    <w:rsid w:val="00401D2E"/>
+    <w:rPr>
+      <w:color w:val="605E5C"/>
+      <w:shd w:val="clear" w:color="auto" w:fill="E1DFDD"/>
     </w:rPr>
   </w:style>
 </w:styles>

</xml_diff>

<commit_message>
finished draft and redid the Q3 insights
</commit_message>
<xml_diff>
--- a/Assignment1/Assignment 1 Write Up.docx
+++ b/Assignment1/Assignment 1 Write Up.docx
@@ -197,7 +197,13 @@
         <w:t xml:space="preserve">Categorical Columns: </w:t>
       </w:r>
       <w:r>
-        <w:t xml:space="preserve">some columns like ROAD_NAME, ROAD_TYPE and LGA_NAME had some of the missing values filled in with a unknown as the rows still featured data that was useful to the case finding but it was just that little gap of data. Using the unknown allowed for the data to remain in the set while also outlining there was some missing values. </w:t>
+        <w:t>some columns like ROAD_NAME, ROAD_TYPE and LGA_NAME had some of the missing values filled in with a</w:t>
+      </w:r>
+      <w:r>
+        <w:t>n</w:t>
+      </w:r>
+      <w:r>
+        <w:t xml:space="preserve"> unknown as the rows still featured data that was useful to the case finding but it was just that little gap of data. Using the unknown allowed for the data to remain in the set while also outlining there was some missing values. </w:t>
       </w:r>
     </w:p>
     <w:p>
@@ -317,13 +323,44 @@
     </w:p>
     <w:p>
       <w:r>
-        <w:t xml:space="preserve">Q1 </w:t>
-      </w:r>
-    </w:p>
-    <w:p>
-      <w:r>
+        <w:t>Q1</w:t>
+      </w:r>
+      <w:r>
+        <w:t>:</w:t>
+      </w:r>
+    </w:p>
+    <w:p/>
+    <w:p>
+      <w:r>
+        <w:t xml:space="preserve">The data was meant to be filtered to only 2023. ACCIDENT_TIME was reparsed with the </w:t>
+      </w:r>
+      <w:proofErr w:type="spellStart"/>
+      <w:r>
+        <w:t>pd.to_datetime</w:t>
+      </w:r>
+      <w:proofErr w:type="spellEnd"/>
+      <w:r>
+        <w:t xml:space="preserve">() to allow extraction of the hour as during the cleaning process, </w:t>
+      </w:r>
+      <w:proofErr w:type="spellStart"/>
+      <w:r>
+        <w:t>dt.hour</w:t>
+      </w:r>
+      <w:proofErr w:type="spellEnd"/>
+      <w:r>
+        <w:t xml:space="preserve"> wasn’t used. </w:t>
+      </w:r>
+    </w:p>
+    <w:p>
+      <w:r>
+        <w:t xml:space="preserve">A heatmap was made so we can see accidents grouped DAY_OF_WEEK, HOUR and count. Days were indexed in the correct order (Monday to Sunday). Hour labels were then converted to 12-hour format so AM and PM is used to readability. The heatmap uses a y10Rd colour scale to display how many accidents. 3PM on weekdays were the most highly dense parts of the heatmap as many people are picking up children from school while it is slightly elevated on Friday and Saturday nights. </w:t>
+      </w:r>
+      <w:r>
+        <w:rPr>
+          <w:noProof/>
+        </w:rPr>
         <w:drawing>
-          <wp:inline distT="0" distB="0" distL="0" distR="0" wp14:anchorId="1F6D3BF2" wp14:editId="3685F636">
+          <wp:inline distT="0" distB="0" distL="0" distR="0" wp14:anchorId="3348D01D" wp14:editId="190FDBE6">
             <wp:extent cx="5731510" cy="1786890"/>
             <wp:effectExtent l="0" t="0" r="2540" b="3810"/>
             <wp:docPr id="1012169669" name="Picture 1"/>
@@ -359,13 +396,20 @@
         </w:drawing>
       </w:r>
     </w:p>
-    <w:p>
+    <w:p/>
+    <w:p/>
+    <w:p/>
+    <w:p>
+      <w:r>
+        <w:lastRenderedPageBreak/>
+        <w:t xml:space="preserve">A line chart was also made to show the accidents grouped by hour and light conditions. The major finding with this chart was that daytime accidents dominate in raw numbers die to the traffic volume, but dark conditions without streetlights show that there is a risk. </w:t>
+      </w:r>
       <w:r>
         <w:rPr>
           <w:noProof/>
         </w:rPr>
         <w:drawing>
-          <wp:inline distT="0" distB="0" distL="0" distR="0" wp14:anchorId="6EB52996" wp14:editId="0EE27DC4">
+          <wp:inline distT="0" distB="0" distL="0" distR="0" wp14:anchorId="4DC29E2C" wp14:editId="79298731">
             <wp:extent cx="5731510" cy="1524635"/>
             <wp:effectExtent l="0" t="0" r="2540" b="0"/>
             <wp:docPr id="2089475154" name="Picture 1"/>
@@ -403,12 +447,20 @@
     </w:p>
     <w:p>
       <w:r>
+        <w:t>The stacked bar chart displays accidents being grouped by days of the week and light conditions while being converted into percentages. It reveals that weekends have a higher proportion of dark condition accidents when compared to weekdays. This could be due to many people being out and about on weekends and being fatigued while at the wheel.</w:t>
+      </w:r>
+      <w:r>
         <w:rPr>
           <w:noProof/>
         </w:rPr>
-        <w:lastRenderedPageBreak/>
+        <w:t xml:space="preserve"> </w:t>
+      </w:r>
+      <w:r>
+        <w:rPr>
+          <w:noProof/>
+        </w:rPr>
         <w:drawing>
-          <wp:inline distT="0" distB="0" distL="0" distR="0" wp14:anchorId="4C765F90" wp14:editId="0909C4D2">
+          <wp:inline distT="0" distB="0" distL="0" distR="0" wp14:anchorId="27CF5935" wp14:editId="760579B9">
             <wp:extent cx="5731510" cy="1826260"/>
             <wp:effectExtent l="0" t="0" r="2540" b="2540"/>
             <wp:docPr id="1448212904" name="Picture 1"/>
@@ -445,22 +497,26 @@
       </w:r>
     </w:p>
     <w:p/>
-    <w:p/>
-    <w:p/>
-    <w:p>
-      <w:r>
-        <w:t xml:space="preserve">Q2: </w:t>
-      </w:r>
-    </w:p>
-    <w:p>
+    <w:p>
+      <w:r>
+        <w:t>Q2:</w:t>
+      </w:r>
+    </w:p>
+    <w:p>
+      <w:r>
+        <w:t xml:space="preserve"> A KDE plot was used to filter the data. Serious Injury Accident and Other injury accident were the main types that were focused on. A KDE plot was used to compare and contrast the distribution of speeds zones between the severity categories. A histogram was considered but KDE beats it as it shows the distribution as a Smoove curve allowing for better analysing. </w:t>
+      </w:r>
+      <w:r>
+        <w:t xml:space="preserve"> </w:t>
+      </w:r>
       <w:r>
         <w:rPr>
           <w:noProof/>
         </w:rPr>
         <w:drawing>
-          <wp:inline distT="0" distB="0" distL="0" distR="0" wp14:anchorId="2331DCA4" wp14:editId="21919FDF">
-            <wp:extent cx="5731510" cy="3636645"/>
-            <wp:effectExtent l="0" t="0" r="2540" b="1905"/>
+          <wp:inline distT="0" distB="0" distL="0" distR="0" wp14:anchorId="1A35E110" wp14:editId="2007ECEB">
+            <wp:extent cx="3617843" cy="2295523"/>
+            <wp:effectExtent l="0" t="0" r="1905" b="0"/>
             <wp:docPr id="1210283055" name="Picture 1"/>
             <wp:cNvGraphicFramePr>
               <a:graphicFrameLocks xmlns:a="http://schemas.openxmlformats.org/drawingml/2006/main" noChangeAspect="1"/>
@@ -481,7 +537,7 @@
                   <pic:spPr>
                     <a:xfrm>
                       <a:off x="0" y="0"/>
-                      <a:ext cx="5731510" cy="3636645"/>
+                      <a:ext cx="3623361" cy="2299024"/>
                     </a:xfrm>
                     <a:prstGeom prst="rect">
                       <a:avLst/>
@@ -496,14 +552,39 @@
     </w:p>
     <w:p>
       <w:r>
+        <w:lastRenderedPageBreak/>
+        <w:t xml:space="preserve">A Bar chart was also used to show the major question of if higher speed zones lead to more victims per accident. </w:t>
+      </w:r>
+      <w:proofErr w:type="spellStart"/>
+      <w:r>
+        <w:t>n</w:t>
+      </w:r>
+      <w:r>
+        <w:t>p.mean</w:t>
+      </w:r>
+      <w:proofErr w:type="spellEnd"/>
+      <w:r>
+        <w:t xml:space="preserve"> was used as the estimator while using seaborn’s </w:t>
+      </w:r>
+      <w:r>
+        <w:t>bar plot</w:t>
+      </w:r>
+      <w:r>
+        <w:t xml:space="preserve">. </w:t>
+      </w:r>
+      <w:r>
+        <w:t xml:space="preserve">It answers that higher speed zones do correlate with more victims per accidents and is consistent with the know relationship between vehicle speed and crash severity. </w:t>
+      </w:r>
+    </w:p>
+    <w:p>
+      <w:r>
         <w:rPr>
           <w:noProof/>
         </w:rPr>
-        <w:lastRenderedPageBreak/>
         <w:drawing>
-          <wp:inline distT="0" distB="0" distL="0" distR="0" wp14:anchorId="31AF754B" wp14:editId="6E64927B">
-            <wp:extent cx="5731510" cy="3653155"/>
-            <wp:effectExtent l="0" t="0" r="2540" b="4445"/>
+          <wp:inline distT="0" distB="0" distL="0" distR="0" wp14:anchorId="0F52B515" wp14:editId="72F9B035">
+            <wp:extent cx="3776870" cy="2407305"/>
+            <wp:effectExtent l="0" t="0" r="0" b="0"/>
             <wp:docPr id="1060458693" name="Picture 1"/>
             <wp:cNvGraphicFramePr>
               <a:graphicFrameLocks xmlns:a="http://schemas.openxmlformats.org/drawingml/2006/main" noChangeAspect="1"/>
@@ -524,7 +605,7 @@
                   <pic:spPr>
                     <a:xfrm>
                       <a:off x="0" y="0"/>
-                      <a:ext cx="5731510" cy="3653155"/>
+                      <a:ext cx="3783459" cy="2411505"/>
                     </a:xfrm>
                     <a:prstGeom prst="rect">
                       <a:avLst/>
@@ -538,11 +619,14 @@
       </w:r>
     </w:p>
     <w:p/>
-    <w:p/>
-    <w:p/>
     <w:p>
       <w:r>
         <w:t>Q3</w:t>
+      </w:r>
+    </w:p>
+    <w:p>
+      <w:r>
+        <w:t xml:space="preserve">The supplied Boxplot (Speed Zone Distribution) was created to shoe the distribution of SPEED_ZONE_NUM for the top 5 LGAS. Boxplots are the best at displaying the data as they can show the median, IQR (interquartile range) and outliers at same time which reveals the difference in road infrastructure. Some LGAS show a wider spread indicating they use a mix of suburban and higher speed roads whereas others cluster tightly around lower speed limits. </w:t>
       </w:r>
     </w:p>
     <w:p>
@@ -587,6 +671,12 @@
         </w:drawing>
       </w:r>
     </w:p>
+    <w:p/>
+    <w:p>
+      <w:r>
+        <w:t>To display severity of accidents a stacked bar chart was used. Accidents were grouped by LGA and severity type and converted into a percentage. The major finding was despite having a high accident volume some LGA’s maintained a lower proportion of serious or fatal crashes due to the lower speed environments when compared to the LGAs with higher speed zones. These accidents displayed a higher serious and fatal injury rate</w:t>
+      </w:r>
+    </w:p>
     <w:p>
       <w:r>
         <w:rPr>
@@ -594,7 +684,7 @@
         </w:rPr>
         <w:lastRenderedPageBreak/>
         <w:drawing>
-          <wp:inline distT="0" distB="0" distL="0" distR="0" wp14:anchorId="293814EF" wp14:editId="16D8CA50">
+          <wp:inline distT="0" distB="0" distL="0" distR="0" wp14:anchorId="521426B7" wp14:editId="4924B418">
             <wp:extent cx="5731510" cy="2588260"/>
             <wp:effectExtent l="0" t="0" r="2540" b="2540"/>
             <wp:docPr id="1767766432" name="Picture 1"/>
@@ -630,16 +720,10 @@
         </w:drawing>
       </w:r>
     </w:p>
-    <w:p>
-      <w:r>
-        <w:rPr>
-          <w:b/>
-          <w:bCs/>
-        </w:rPr>
-        <w:t>Q3 Insights:</w:t>
-      </w:r>
-      <w:r>
-        <w:t xml:space="preserve"> The top 5 LGAs by accident count reflect high-traffic urban areas. The speed zone boxplots reveal differences in road infrastructure — some LGAs have a wider spread of speed zones, indicating a mix of suburban and arterial roads, while others cluster around lower urban speed limits. The severity breakdown shows that despite having high accident volumes, some LGAs maintain a lower proportion of serious/fatal crashes, possibly due to lower speed environments and better road infrastructure. LGAs with more high-speed zone accidents tend to show higher serious injury rates, consistent with the known relationship between vehicle speed and crash severity.</w:t>
+    <w:p/>
+    <w:p>
+      <w:r>
+        <w:t>Q3 Insights: The top 5 LGAS by accident count reflect high-traffic urban arenas. The speed zone boxplots reveal the difference in road infrastructure while some LGAs have a mix of suburban and arterial roads while others cluster around lower speed limits in urban areas. The severity breakdown shows that despite having higher accident volumes, many of the LGAs maintain a lower proportion of serious and fatal crashes, this could be possible due to the lower speed environments and better roads. LGAs with higher speed zones tend to have more accidents that are serious or fatal. This is consistent with the relationship between vehicle speed and crash severity.</w:t>
       </w:r>
     </w:p>
     <w:p/>
@@ -649,271 +733,6 @@
     <w:p/>
     <w:p/>
     <w:p/>
-    <w:p/>
-    <w:p/>
-    <w:p/>
-    <w:p/>
-    <w:p/>
-    <w:p/>
-    <w:p/>
-    <w:p/>
-    <w:p/>
-    <w:p/>
-    <w:p/>
-    <w:p/>
-    <w:p/>
-    <w:p/>
-    <w:p/>
-    <w:p/>
-    <w:p/>
-    <w:p/>
-    <w:p>
-      <w:r>
-        <w:rPr>
-          <w:b/>
-          <w:bCs/>
-        </w:rPr>
-        <w:t>DATA EXPLORATION</w:t>
-      </w:r>
-    </w:p>
-    <w:p>
-      <w:r>
-        <w:rPr>
-          <w:b/>
-          <w:bCs/>
-        </w:rPr>
-        <w:t>Q1 — Accident Frequencies by Day, Hour and Light Condition (2023)</w:t>
-      </w:r>
-    </w:p>
-    <w:p>
-      <w:r>
-        <w:t xml:space="preserve">The data was first filtered to 2023 only. The ACCIDENT_TIME column was re-parsed using </w:t>
-      </w:r>
-      <w:proofErr w:type="spellStart"/>
-      <w:r>
-        <w:t>pd.to_datetime</w:t>
-      </w:r>
-      <w:proofErr w:type="spellEnd"/>
-      <w:r>
-        <w:t>() to allow extraction of the hour via .</w:t>
-      </w:r>
-      <w:proofErr w:type="spellStart"/>
-      <w:r>
-        <w:t>dt.hour</w:t>
-      </w:r>
-      <w:proofErr w:type="spellEnd"/>
-      <w:r>
-        <w:t xml:space="preserve"> — this was necessary because the time object format from Task 1 doesn't support .dt accessor directly.</w:t>
-      </w:r>
-    </w:p>
-    <w:p>
-      <w:r>
-        <w:rPr>
-          <w:i/>
-          <w:iCs/>
-        </w:rPr>
-        <w:t>Chart 1 — Heatmap:</w:t>
-      </w:r>
-      <w:r>
-        <w:t xml:space="preserve"> Accidents were grouped by DAY_OF_WEEK and HOUR and counted. Days were reindexed in correct order (Monday to Sunday). Hour labels were converted to 12-hour AM/PM format for readability. The heatmap uses a </w:t>
-      </w:r>
-      <w:proofErr w:type="spellStart"/>
-      <w:r>
-        <w:t>YlOrRd</w:t>
-      </w:r>
-      <w:proofErr w:type="spellEnd"/>
-      <w:r>
-        <w:t xml:space="preserve"> colour scale where darker red indicates more accidents. Key finding: the peak accident time is </w:t>
-      </w:r>
-      <w:r>
-        <w:rPr>
-          <w:b/>
-          <w:bCs/>
-        </w:rPr>
-        <w:t>3pm on weekdays</w:t>
-      </w:r>
-      <w:r>
-        <w:t xml:space="preserve"> corresponding to school pickup time, not traditional rush hour. Friday and Saturday nights also show elevated activity.</w:t>
-      </w:r>
-    </w:p>
-    <w:p>
-      <w:r>
-        <w:rPr>
-          <w:i/>
-          <w:iCs/>
-        </w:rPr>
-        <w:t>Chart 2 — Line Chart:</w:t>
-      </w:r>
-      <w:r>
-        <w:t xml:space="preserve"> Accidents were grouped by hour and light condition and plotted as a line chart with markers. This shows how each lighting condition contributes to accidents across the day. Key finding: daytime accidents dominate in raw numbers due to traffic volume, but dark conditions without street lighting show disproportionate risk relative to the amount of traffic present at those hours.</w:t>
-      </w:r>
-    </w:p>
-    <w:p>
-      <w:r>
-        <w:rPr>
-          <w:i/>
-          <w:iCs/>
-        </w:rPr>
-        <w:t>Chart 3 — Stacked Bar Chart:</w:t>
-      </w:r>
-      <w:r>
-        <w:t xml:space="preserve"> Accidents were grouped by day of week and light condition, converted to percentages of the daily total, and plotted as a stacked bar chart. This reveals that weekends have a higher proportion of dark condition accidents compared to weekdays, suggesting compounding risk factors such as alcohol, fatigue and reduced visibility on weekend nights.</w:t>
-      </w:r>
-    </w:p>
-    <w:p>
-      <w:r>
-        <w:pict w14:anchorId="658133B8">
-          <v:rect id="_x0000_i1043" style="width:0;height:1.5pt" o:hralign="center" o:hrstd="t" o:hr="t" fillcolor="#a0a0a0" stroked="f"/>
-        </w:pict>
-      </w:r>
-    </w:p>
-    <w:p>
-      <w:r>
-        <w:rPr>
-          <w:b/>
-          <w:bCs/>
-        </w:rPr>
-        <w:t>Q2 — Speed Zone vs Number of Victims</w:t>
-      </w:r>
-    </w:p>
-    <w:p>
-      <w:r>
-        <w:rPr>
-          <w:i/>
-          <w:iCs/>
-        </w:rPr>
-        <w:t>Chart 1 — KDE Plot:</w:t>
-      </w:r>
-      <w:r>
-        <w:t xml:space="preserve"> The data was filtered to 'Serious injury accident' and 'Other injury accident' severity types only. A KDE (Kernel Density Estimation) plot was used to compare the distribution of speed zones between the two severity categories. KDE was chosen over a histogram because it shows the shape of the distribution as a smooth curve, making it easier to compare two groups visually. </w:t>
-      </w:r>
-      <w:proofErr w:type="spellStart"/>
-      <w:r>
-        <w:t>common_norm</w:t>
-      </w:r>
-      <w:proofErr w:type="spellEnd"/>
-      <w:r>
-        <w:t>=False was used so each curve is normalised independently, allowing fair comparison regardless of group size.</w:t>
-      </w:r>
-    </w:p>
-    <w:p>
-      <w:r>
-        <w:rPr>
-          <w:i/>
-          <w:iCs/>
-        </w:rPr>
-        <w:lastRenderedPageBreak/>
-        <w:t>Chart 2 — Bar Chart:</w:t>
-      </w:r>
-      <w:r>
-        <w:t xml:space="preserve"> The average number of victims (INJ_OR_FATAL) per accident was calculated for each speed zone using </w:t>
-      </w:r>
-      <w:proofErr w:type="spellStart"/>
-      <w:r>
-        <w:t>np.mean</w:t>
-      </w:r>
-      <w:proofErr w:type="spellEnd"/>
-      <w:r>
-        <w:t xml:space="preserve"> as the estimator in </w:t>
-      </w:r>
-      <w:proofErr w:type="spellStart"/>
-      <w:r>
-        <w:t>seaborn's</w:t>
-      </w:r>
-      <w:proofErr w:type="spellEnd"/>
-      <w:r>
-        <w:t xml:space="preserve"> </w:t>
-      </w:r>
-      <w:proofErr w:type="spellStart"/>
-      <w:r>
-        <w:t>barplot</w:t>
-      </w:r>
-      <w:proofErr w:type="spellEnd"/>
-      <w:r>
-        <w:t>. This directly answers whether higher speed zones lead to more victims per accident. Key finding: higher speed zones correlate with more victims per accident, consistent with the known relationship between vehicle speed and crash severity.</w:t>
-      </w:r>
-    </w:p>
-    <w:p>
-      <w:r>
-        <w:pict w14:anchorId="28AA194C">
-          <v:rect id="_x0000_i1044" style="width:0;height:1.5pt" o:hralign="center" o:hrstd="t" o:hr="t" fillcolor="#a0a0a0" stroked="f"/>
-        </w:pict>
-      </w:r>
-    </w:p>
-    <w:p>
-      <w:r>
-        <w:rPr>
-          <w:b/>
-          <w:bCs/>
-        </w:rPr>
-        <w:t>Q3 — Crash Distribution by Geographic Area</w:t>
-      </w:r>
-    </w:p>
-    <w:p>
-      <w:r>
-        <w:rPr>
-          <w:i/>
-          <w:iCs/>
-        </w:rPr>
-        <w:t>Identifying Top 5 LGAs:</w:t>
-      </w:r>
-      <w:r>
-        <w:t xml:space="preserve"> </w:t>
-      </w:r>
-      <w:proofErr w:type="spellStart"/>
-      <w:r>
-        <w:t>value_counts</w:t>
-      </w:r>
-      <w:proofErr w:type="spellEnd"/>
-      <w:r>
-        <w:t>() was used on LGA_NAME and .</w:t>
-      </w:r>
-      <w:proofErr w:type="spellStart"/>
-      <w:r>
-        <w:t>nlargest</w:t>
-      </w:r>
-      <w:proofErr w:type="spellEnd"/>
-      <w:r>
-        <w:t>(5) selected the five Local Government Areas with the highest total accident counts. The dataset was then filtered to only those five LGAs.</w:t>
-      </w:r>
-    </w:p>
-    <w:p>
-      <w:r>
-        <w:rPr>
-          <w:i/>
-          <w:iCs/>
-        </w:rPr>
-        <w:t>Chart 1 — Boxplot (Speed Zone Distribution):</w:t>
-      </w:r>
-      <w:r>
-        <w:t xml:space="preserve"> A boxplot was created showing the distribution of SPEED_ZONE_NUM for each of the top 5 LGAs. Boxplots were chosen because they show the median, interquartile range, and outliers simultaneously, revealing differences in road infrastructure across LGAs. Some LGAs show a wider spread indicating a mix of suburban and high-speed arterial roads, while others cluster tightly around lower urban speed limits.</w:t>
-      </w:r>
-    </w:p>
-    <w:p>
-      <w:r>
-        <w:rPr>
-          <w:i/>
-          <w:iCs/>
-        </w:rPr>
-        <w:t>Chart 2 — Stacked Bar Chart (Severity Breakdown):</w:t>
-      </w:r>
-      <w:r>
-        <w:t xml:space="preserve"> Accidents were grouped by LGA and severity type, converted to percentages of each LGA's total, and plotted as a stacked bar chart. Key finding: despite having high accident volumes, some LGAs maintain lower proportions of serious/fatal crashes, likely due to lower speed environments. LGAs with more high-speed zone accidents tend to show higher serious injury rates.</w:t>
-      </w:r>
-    </w:p>
-    <w:p/>
-    <w:p/>
-    <w:p/>
-    <w:p/>
-    <w:p/>
-    <w:p/>
-    <w:p/>
-    <w:p/>
-    <w:p/>
-    <w:p/>
-    <w:p/>
-    <w:p/>
-    <w:p/>
     <w:p>
       <w:pPr>
         <w:rPr>
@@ -933,7 +752,6 @@
     </w:p>
     <w:p>
       <w:r>
-        <w:lastRenderedPageBreak/>
         <w:t xml:space="preserve">The pandas development team. (2024). </w:t>
       </w:r>
       <w:r>
@@ -1003,6 +821,7 @@
     </w:p>
     <w:p>
       <w:r>
+        <w:lastRenderedPageBreak/>
         <w:t xml:space="preserve">Waskom, M. L. (2021). seaborn: Statistical data visualization. </w:t>
       </w:r>
       <w:r>
@@ -2047,6 +1866,7 @@
   <w:style w:type="paragraph" w:default="1" w:styleId="Normal">
     <w:name w:val="Normal"/>
     <w:qFormat/>
+    <w:rsid w:val="00D5524B"/>
   </w:style>
   <w:style w:type="paragraph" w:styleId="Heading1">
     <w:name w:val="heading 1"/>

</xml_diff>

<commit_message>
Finished off the report and will recheck the data before submit
</commit_message>
<xml_diff>
--- a/Assignment1/Assignment 1 Write Up.docx
+++ b/Assignment1/Assignment 1 Write Up.docx
@@ -29,30 +29,43 @@
     </w:p>
     <w:p>
       <w:r>
-        <w:t xml:space="preserve">The Dataset provided displays the crashes during a set </w:t>
-      </w:r>
-      <w:r>
-        <w:t>period</w:t>
-      </w:r>
-      <w:r>
-        <w:t xml:space="preserve"> in Victoria. </w:t>
+        <w:t xml:space="preserve">The Dataset provided displays the </w:t>
+      </w:r>
+      <w:r>
+        <w:t>crashes,</w:t>
+      </w:r>
+      <w:r>
+        <w:t xml:space="preserve"> Victoria.</w:t>
       </w:r>
       <w:r>
         <w:t xml:space="preserve"> After manually analysing the spreadsheet and identifying the most important information needed for analysing, I used the </w:t>
       </w:r>
       <w:proofErr w:type="spellStart"/>
+      <w:proofErr w:type="gramStart"/>
       <w:r>
         <w:t>pd.read</w:t>
       </w:r>
+      <w:proofErr w:type="gramEnd"/>
       <w:r>
         <w:t>_</w:t>
       </w:r>
+      <w:proofErr w:type="gramStart"/>
       <w:r>
         <w:t>csv</w:t>
       </w:r>
       <w:proofErr w:type="spellEnd"/>
       <w:r>
-        <w:t>() to load the crash set into the pandas Data Frame. As I’m using python it is the best way to get the csv data in and be available to be cleansed. In the entire dataset there was 150,</w:t>
+        <w:t>(</w:t>
+      </w:r>
+      <w:proofErr w:type="gramEnd"/>
+      <w:r>
+        <w:t xml:space="preserve">) to load the crash set into the pandas Data Frame. As I’m using python it is the best way to get the csv data in and be available to be cleansed. In the entire dataset there was </w:t>
+      </w:r>
+      <w:r>
+        <w:t xml:space="preserve">a total of </w:t>
+      </w:r>
+      <w:r>
+        <w:t>150,</w:t>
       </w:r>
       <w:r>
         <w:t>000</w:t>
@@ -77,19 +90,78 @@
       </w:r>
       <w:proofErr w:type="spellStart"/>
       <w:r>
-        <w:t>parse_date</w:t>
+        <w:t>parse_</w:t>
+      </w:r>
+      <w:proofErr w:type="gramStart"/>
+      <w:r>
+        <w:t>date</w:t>
       </w:r>
       <w:proofErr w:type="spellEnd"/>
       <w:r>
-        <w:t xml:space="preserve">() and </w:t>
+        <w:t>(</w:t>
+      </w:r>
+      <w:proofErr w:type="gramEnd"/>
+      <w:r>
+        <w:t xml:space="preserve">) and </w:t>
       </w:r>
       <w:proofErr w:type="spellStart"/>
       <w:r>
-        <w:t>parse_time</w:t>
+        <w:t>parse_</w:t>
+      </w:r>
+      <w:proofErr w:type="gramStart"/>
+      <w:r>
+        <w:t>time</w:t>
       </w:r>
       <w:proofErr w:type="spellEnd"/>
       <w:r>
-        <w:t>() with try and except blocks. This allowed for values that couldn’t be parsed to return NaN which stops the script from crashing. ACCIDENT_DATE was converted into a datetime format (DD/MM/YYYY) and ACCIDENT_TIME was converted to a time object (HH:MM:SS) as a result.</w:t>
+        <w:t>(</w:t>
+      </w:r>
+      <w:proofErr w:type="gramEnd"/>
+      <w:r>
+        <w:t>) with try and except blocks</w:t>
+      </w:r>
+      <w:r>
+        <w:t>,</w:t>
+      </w:r>
+      <w:r>
+        <w:t xml:space="preserve"> </w:t>
+      </w:r>
+      <w:r>
+        <w:t>using this</w:t>
+      </w:r>
+      <w:r>
+        <w:t xml:space="preserve"> allowed for values that couldn’t be parsed to return </w:t>
+      </w:r>
+      <w:proofErr w:type="spellStart"/>
+      <w:r>
+        <w:t>NaN</w:t>
+      </w:r>
+      <w:proofErr w:type="spellEnd"/>
+      <w:r>
+        <w:t xml:space="preserve"> </w:t>
+      </w:r>
+      <w:r>
+        <w:t>that would</w:t>
+      </w:r>
+      <w:r>
+        <w:t xml:space="preserve"> stop the script from crashing</w:t>
+      </w:r>
+      <w:r>
+        <w:t xml:space="preserve"> when being fed into the script</w:t>
+      </w:r>
+      <w:r>
+        <w:t>. ACCIDENT_DATE was converted into a datetime format (DD/MM/YYYY) and ACCIDENT_TIME was converted to a time object (HH:</w:t>
+      </w:r>
+      <w:proofErr w:type="gramStart"/>
+      <w:r>
+        <w:t>MM:SS</w:t>
+      </w:r>
+      <w:proofErr w:type="gramEnd"/>
+      <w:r>
+        <w:t>)</w:t>
+      </w:r>
+      <w:r>
+        <w:t xml:space="preserve"> which allows easier analysis and pinpointing correct date and time when put into graphs. </w:t>
       </w:r>
     </w:p>
     <w:p>
@@ -146,7 +218,19 @@
         <w:t>the column</w:t>
       </w:r>
       <w:r>
-        <w:t xml:space="preserve"> as keeping them or even adding in new values to replace them could be misleading. </w:t>
+        <w:t xml:space="preserve"> </w:t>
+      </w:r>
+      <w:r>
+        <w:t>due to if it was</w:t>
+      </w:r>
+      <w:r>
+        <w:t xml:space="preserve"> ke</w:t>
+      </w:r>
+      <w:r>
+        <w:t>pt</w:t>
+      </w:r>
+      <w:r>
+        <w:t xml:space="preserve"> or even adding in new values to replace them could be misleading. </w:t>
       </w:r>
     </w:p>
     <w:p>
@@ -164,7 +248,7 @@
         <w:t xml:space="preserve"> and NO_OF_VEHICLES </w:t>
       </w:r>
       <w:r>
-        <w:t>columns</w:t>
+        <w:t>rows</w:t>
       </w:r>
       <w:r>
         <w:t xml:space="preserve"> had a few missing values which in perspective of the dataset shouldn’t </w:t>
@@ -253,19 +337,45 @@
       </w:r>
       <w:proofErr w:type="spellStart"/>
       <w:r>
-        <w:t>clean_speed</w:t>
+        <w:t>clean_</w:t>
+      </w:r>
+      <w:proofErr w:type="gramStart"/>
+      <w:r>
+        <w:t>speed</w:t>
       </w:r>
       <w:proofErr w:type="spellEnd"/>
       <w:r>
-        <w:t>() was a function made to handle to return NaN for missing values, entries that contained either ‘not know’ or ‘other’ and speeds that were over 110km/hr or equal to 0. Filter(</w:t>
+        <w:t>(</w:t>
+      </w:r>
+      <w:proofErr w:type="gramEnd"/>
+      <w:r>
+        <w:t xml:space="preserve">) was a function made to handle to return </w:t>
       </w:r>
       <w:proofErr w:type="spellStart"/>
       <w:r>
+        <w:t>NaN</w:t>
+      </w:r>
+      <w:proofErr w:type="spellEnd"/>
+      <w:r>
+        <w:t xml:space="preserve"> for missing values, entries that contained either ‘not know’ or ‘other’ and speeds that were over 110km/hr or equal to 0. Filter(</w:t>
+      </w:r>
+      <w:proofErr w:type="spellStart"/>
+      <w:proofErr w:type="gramStart"/>
+      <w:r>
         <w:t>str.isdigit</w:t>
       </w:r>
       <w:proofErr w:type="spellEnd"/>
-      <w:r>
-        <w:t xml:space="preserve">) helped with the extraction of entries that had the km/hr instead of the integer. At the end of this it returned a valid speed and were stored in a column ‘SPEED_ZONE_NUM’ using pandas Int64 which can hold both NaN values and whole numbers whereas regular python int cannot. </w:t>
+      <w:proofErr w:type="gramEnd"/>
+      <w:r>
+        <w:t xml:space="preserve">) helped with the extraction of entries that had the km/hr instead of the integer. At the end of this it returned a valid speed and were stored in a column ‘SPEED_ZONE_NUM’ using pandas Int64 which can hold both </w:t>
+      </w:r>
+      <w:proofErr w:type="spellStart"/>
+      <w:r>
+        <w:t>NaN</w:t>
+      </w:r>
+      <w:proofErr w:type="spellEnd"/>
+      <w:r>
+        <w:t xml:space="preserve"> values and whole numbers whereas regular python int cannot. </w:t>
       </w:r>
     </w:p>
     <w:p>
@@ -283,7 +393,15 @@
         <w:t>NO_OF_VEHICLES, HEAVYVEHICLE, PASSENGERVEHICLE, MOTORCYCLE, PT_VEHICLE</w:t>
       </w:r>
       <w:r>
-        <w:t xml:space="preserve">) were converted from a float to a integer as fractional counts are meaningless. ROAD_ROUTE_1 had its missing values filled with 0 before it was converted into an integer </w:t>
+        <w:t xml:space="preserve">) were converted from a float to </w:t>
+      </w:r>
+      <w:proofErr w:type="gramStart"/>
+      <w:r>
+        <w:t>a</w:t>
+      </w:r>
+      <w:proofErr w:type="gramEnd"/>
+      <w:r>
+        <w:t xml:space="preserve"> integer as fractional counts are meaningless. ROAD_ROUTE_1 had its missing values filled with 0 before it was converted into an integer </w:t>
       </w:r>
     </w:p>
     <w:p>
@@ -304,12 +422,17 @@
       <w:r>
         <w:t>_</w:t>
       </w:r>
+      <w:proofErr w:type="gramStart"/>
       <w:r>
         <w:t>csv</w:t>
       </w:r>
       <w:proofErr w:type="spellEnd"/>
       <w:r>
-        <w:t xml:space="preserve">() with index=False to avoid writing the row numbers as a column. </w:t>
+        <w:t>(</w:t>
+      </w:r>
+      <w:proofErr w:type="gramEnd"/>
+      <w:r>
+        <w:t xml:space="preserve">) with index=False to avoid writing the row numbers as a column. </w:t>
       </w:r>
     </w:p>
     <w:p/>
@@ -336,34 +459,56 @@
       </w:r>
       <w:proofErr w:type="spellStart"/>
       <w:r>
-        <w:t>pd.to_datetime</w:t>
+        <w:t>pd.to_</w:t>
+      </w:r>
+      <w:proofErr w:type="gramStart"/>
+      <w:r>
+        <w:t>datetime</w:t>
       </w:r>
       <w:proofErr w:type="spellEnd"/>
       <w:r>
-        <w:t xml:space="preserve">() to allow extraction of the hour as during the cleaning process, </w:t>
+        <w:t>(</w:t>
+      </w:r>
+      <w:proofErr w:type="gramEnd"/>
+      <w:r>
+        <w:t xml:space="preserve">) to allow extraction of the hour as during the cleaning process, </w:t>
       </w:r>
       <w:proofErr w:type="spellStart"/>
+      <w:proofErr w:type="gramStart"/>
       <w:r>
         <w:t>dt.hour</w:t>
       </w:r>
       <w:proofErr w:type="spellEnd"/>
+      <w:proofErr w:type="gramEnd"/>
       <w:r>
         <w:t xml:space="preserve"> wasn’t used. </w:t>
       </w:r>
     </w:p>
     <w:p>
-      <w:r>
-        <w:t xml:space="preserve">A heatmap was made so we can see accidents grouped DAY_OF_WEEK, HOUR and count. Days were indexed in the correct order (Monday to Sunday). Hour labels were then converted to 12-hour format so AM and PM is used to readability. The heatmap uses a y10Rd colour scale to display how many accidents. 3PM on weekdays were the most highly dense parts of the heatmap as many people are picking up children from school while it is slightly elevated on Friday and Saturday nights. </w:t>
-      </w:r>
-      <w:r>
+      <w:pPr>
         <w:rPr>
           <w:noProof/>
         </w:rPr>
+      </w:pPr>
+      <w:r>
+        <w:t xml:space="preserve">A heatmap was made so we can see accidents grouped DAY_OF_WEEK, HOUR and count. Days were indexed in the correct order (Monday to Sunday). Hour labels were then converted to 12-hour format so AM and PM is used to readability. The heatmap uses a </w:t>
+      </w:r>
+      <w:proofErr w:type="spellStart"/>
+      <w:r>
+        <w:t>YlOrRd</w:t>
+      </w:r>
+      <w:proofErr w:type="spellEnd"/>
+      <w:r>
+        <w:t xml:space="preserve"> colour scale to display how many accidents. 3PM on weekdays were the most highly dense parts of the heatmap as many people are picking up children from school while it is slightly elevated on Friday and Saturday nights. </w:t>
+      </w:r>
+    </w:p>
+    <w:p>
+      <w:r>
         <w:drawing>
-          <wp:inline distT="0" distB="0" distL="0" distR="0" wp14:anchorId="3348D01D" wp14:editId="190FDBE6">
+          <wp:inline distT="0" distB="0" distL="0" distR="0" wp14:anchorId="1BA7C895" wp14:editId="195883A1">
             <wp:extent cx="5731510" cy="1786890"/>
             <wp:effectExtent l="0" t="0" r="2540" b="3810"/>
-            <wp:docPr id="1012169669" name="Picture 1"/>
+            <wp:docPr id="1491344229" name="Picture 1"/>
             <wp:cNvGraphicFramePr>
               <a:graphicFrameLocks xmlns:a="http://schemas.openxmlformats.org/drawingml/2006/main" noChangeAspect="1"/>
             </wp:cNvGraphicFramePr>
@@ -371,7 +516,7 @@
               <a:graphicData uri="http://schemas.openxmlformats.org/drawingml/2006/picture">
                 <pic:pic xmlns:pic="http://schemas.openxmlformats.org/drawingml/2006/picture">
                   <pic:nvPicPr>
-                    <pic:cNvPr id="1012169669" name=""/>
+                    <pic:cNvPr id="1491344229" name=""/>
                     <pic:cNvPicPr/>
                   </pic:nvPicPr>
                   <pic:blipFill>
@@ -402,7 +547,19 @@
     <w:p>
       <w:r>
         <w:lastRenderedPageBreak/>
-        <w:t xml:space="preserve">A line chart was also made to show the accidents grouped by hour and light conditions. The major finding with this chart was that daytime accidents dominate in raw numbers die to the traffic volume, but dark conditions without streetlights show that there is a risk. </w:t>
+        <w:t xml:space="preserve">A line chart was also made to show the accidents grouped by hour and light conditions. The major finding with this chart was that daytime accidents dominate in raw numbers </w:t>
+      </w:r>
+      <w:r>
+        <w:t>due</w:t>
+      </w:r>
+      <w:r>
+        <w:t xml:space="preserve"> to the traffic volume but dark conditions without streetlights show that there is</w:t>
+      </w:r>
+      <w:r>
+        <w:t xml:space="preserve"> still</w:t>
+      </w:r>
+      <w:r>
+        <w:t xml:space="preserve"> a risk. </w:t>
       </w:r>
       <w:r>
         <w:rPr>
@@ -504,7 +661,35 @@
     </w:p>
     <w:p>
       <w:r>
-        <w:t xml:space="preserve"> A KDE plot was used to filter the data. Serious Injury Accident and Other injury accident were the main types that were focused on. A KDE plot was used to compare and contrast the distribution of speeds zones between the severity categories. A histogram was considered but KDE beats it as it shows the distribution as a Smoove curve allowing for better analysing. </w:t>
+        <w:t xml:space="preserve"> </w:t>
+      </w:r>
+      <w:r>
+        <w:t xml:space="preserve">A KDE plot was created to compare the distribution of speed zone </w:t>
+      </w:r>
+      <w:r>
+        <w:t xml:space="preserve">data. Serious Injury Accident and Other injury accident were the main types that were focused on. A KDE plot was used to </w:t>
+      </w:r>
+      <w:proofErr w:type="gramStart"/>
+      <w:r>
+        <w:t>compare and contrast</w:t>
+      </w:r>
+      <w:proofErr w:type="gramEnd"/>
+      <w:r>
+        <w:t xml:space="preserve"> the distribution of speeds zones between the severity categories. A histogram was considered but KDE beats it as it shows the distribution as a </w:t>
+      </w:r>
+      <w:r>
+        <w:t>smooth</w:t>
+      </w:r>
+      <w:r>
+        <w:t xml:space="preserve"> </w:t>
+      </w:r>
+      <w:r>
+        <w:t>curve allowing for better analysing</w:t>
+      </w:r>
+    </w:p>
+    <w:p>
+      <w:r>
+        <w:t xml:space="preserve">. </w:t>
       </w:r>
       <w:r>
         <w:t xml:space="preserve"> </w:t>
@@ -514,7 +699,7 @@
           <w:noProof/>
         </w:rPr>
         <w:drawing>
-          <wp:inline distT="0" distB="0" distL="0" distR="0" wp14:anchorId="1A35E110" wp14:editId="2007ECEB">
+          <wp:inline distT="0" distB="0" distL="0" distR="0" wp14:anchorId="16628D4C" wp14:editId="5DD362BE">
             <wp:extent cx="3617843" cy="2295523"/>
             <wp:effectExtent l="0" t="0" r="1905" b="0"/>
             <wp:docPr id="1210283055" name="Picture 1"/>
@@ -556,6 +741,7 @@
         <w:t xml:space="preserve">A Bar chart was also used to show the major question of if higher speed zones lead to more victims per accident. </w:t>
       </w:r>
       <w:proofErr w:type="spellStart"/>
+      <w:proofErr w:type="gramStart"/>
       <w:r>
         <w:t>n</w:t>
       </w:r>
@@ -563,8 +749,17 @@
         <w:t>p.mean</w:t>
       </w:r>
       <w:proofErr w:type="spellEnd"/>
-      <w:r>
-        <w:t xml:space="preserve"> was used as the estimator while using seaborn’s </w:t>
+      <w:proofErr w:type="gramEnd"/>
+      <w:r>
+        <w:t xml:space="preserve"> was used as the estimator while using </w:t>
+      </w:r>
+      <w:proofErr w:type="spellStart"/>
+      <w:r>
+        <w:t>seaborn’s</w:t>
+      </w:r>
+      <w:proofErr w:type="spellEnd"/>
+      <w:r>
+        <w:t xml:space="preserve"> </w:t>
       </w:r>
       <w:r>
         <w:t>bar plot</w:t>
@@ -573,19 +768,22 @@
         <w:t xml:space="preserve">. </w:t>
       </w:r>
       <w:r>
-        <w:t xml:space="preserve">It answers that higher speed zones do correlate with more victims per accidents and is consistent with the know relationship between vehicle speed and crash severity. </w:t>
-      </w:r>
-    </w:p>
-    <w:p>
-      <w:r>
-        <w:rPr>
-          <w:noProof/>
-        </w:rPr>
+        <w:t>It answers that higher speed zones do correlate with more victims per accidents and is consistent with the know</w:t>
+      </w:r>
+      <w:r>
+        <w:t>n</w:t>
+      </w:r>
+      <w:r>
+        <w:t xml:space="preserve"> relationship between vehicle speed and crash severity. </w:t>
+      </w:r>
+    </w:p>
+    <w:p>
+      <w:r>
         <w:drawing>
-          <wp:inline distT="0" distB="0" distL="0" distR="0" wp14:anchorId="0F52B515" wp14:editId="72F9B035">
-            <wp:extent cx="3776870" cy="2407305"/>
-            <wp:effectExtent l="0" t="0" r="0" b="0"/>
-            <wp:docPr id="1060458693" name="Picture 1"/>
+          <wp:inline distT="0" distB="0" distL="0" distR="0" wp14:anchorId="7B29FBFB" wp14:editId="406E4A30">
+            <wp:extent cx="5731510" cy="3692525"/>
+            <wp:effectExtent l="0" t="0" r="2540" b="3175"/>
+            <wp:docPr id="1251103427" name="Picture 1"/>
             <wp:cNvGraphicFramePr>
               <a:graphicFrameLocks xmlns:a="http://schemas.openxmlformats.org/drawingml/2006/main" noChangeAspect="1"/>
             </wp:cNvGraphicFramePr>
@@ -593,7 +791,7 @@
               <a:graphicData uri="http://schemas.openxmlformats.org/drawingml/2006/picture">
                 <pic:pic xmlns:pic="http://schemas.openxmlformats.org/drawingml/2006/picture">
                   <pic:nvPicPr>
-                    <pic:cNvPr id="1060458693" name=""/>
+                    <pic:cNvPr id="1251103427" name=""/>
                     <pic:cNvPicPr/>
                   </pic:nvPicPr>
                   <pic:blipFill>
@@ -605,7 +803,7 @@
                   <pic:spPr>
                     <a:xfrm>
                       <a:off x="0" y="0"/>
-                      <a:ext cx="3783459" cy="2411505"/>
+                      <a:ext cx="5731510" cy="3692525"/>
                     </a:xfrm>
                     <a:prstGeom prst="rect">
                       <a:avLst/>
@@ -626,7 +824,25 @@
     </w:p>
     <w:p>
       <w:r>
-        <w:t xml:space="preserve">The supplied Boxplot (Speed Zone Distribution) was created to shoe the distribution of SPEED_ZONE_NUM for the top 5 LGAS. Boxplots are the best at displaying the data as they can show the median, IQR (interquartile range) and outliers at same time which reveals the difference in road infrastructure. Some LGAS show a wider spread indicating they use a mix of suburban and higher speed roads whereas others cluster tightly around lower speed limits. </w:t>
+        <w:t xml:space="preserve">The top 5 LGAS by accident count reflect high-traffic urban areas. The speed zone boxplots </w:t>
+      </w:r>
+      <w:r>
+        <w:t xml:space="preserve">were the most ideal graph to use as it shows the median, IQR and outliers in parallel. This </w:t>
+      </w:r>
+      <w:r>
+        <w:t>reveal</w:t>
+      </w:r>
+      <w:r>
+        <w:t>s</w:t>
+      </w:r>
+      <w:r>
+        <w:t xml:space="preserve"> the difference in road infrastructure while some LGAs have a mix of suburban and arterial roads while others cluster around lower speed limits in urban areas. The severity breakdown</w:t>
+      </w:r>
+      <w:r>
+        <w:t xml:space="preserve"> was visualized by a stacked bar chart with the LGAs grouped by different accident counts. The chart</w:t>
+      </w:r>
+      <w:r>
+        <w:t xml:space="preserve"> shows that despite having higher accident volumes, many of the LGAs maintain a lower proportion of serious and fatal crashes, this could be possible due to the lower speed environments and better roads. LGAs with higher speed zones tend to have more accidents that are serious or fatal. This is consistent with the relationship between vehicle speed and crash severity.</w:t>
       </w:r>
     </w:p>
     <w:p>
@@ -634,11 +850,12 @@
         <w:rPr>
           <w:noProof/>
         </w:rPr>
+        <w:lastRenderedPageBreak/>
         <w:drawing>
-          <wp:inline distT="0" distB="0" distL="0" distR="0" wp14:anchorId="4CC07BB6" wp14:editId="0A000990">
+          <wp:inline distT="0" distB="0" distL="0" distR="0" wp14:anchorId="5495DEAA" wp14:editId="65F0B73F">
             <wp:extent cx="5731510" cy="2578735"/>
             <wp:effectExtent l="0" t="0" r="2540" b="0"/>
-            <wp:docPr id="801190212" name="Picture 1"/>
+            <wp:docPr id="39699677" name="Picture 1"/>
             <wp:cNvGraphicFramePr>
               <a:graphicFrameLocks xmlns:a="http://schemas.openxmlformats.org/drawingml/2006/main" noChangeAspect="1"/>
             </wp:cNvGraphicFramePr>
@@ -646,7 +863,7 @@
               <a:graphicData uri="http://schemas.openxmlformats.org/drawingml/2006/picture">
                 <pic:pic xmlns:pic="http://schemas.openxmlformats.org/drawingml/2006/picture">
                   <pic:nvPicPr>
-                    <pic:cNvPr id="801190212" name=""/>
+                    <pic:cNvPr id="39699677" name=""/>
                     <pic:cNvPicPr/>
                   </pic:nvPicPr>
                   <pic:blipFill>
@@ -674,15 +891,9 @@
     <w:p/>
     <w:p>
       <w:r>
-        <w:t>To display severity of accidents a stacked bar chart was used. Accidents were grouped by LGA and severity type and converted into a percentage. The major finding was despite having a high accident volume some LGA’s maintained a lower proportion of serious or fatal crashes due to the lower speed environments when compared to the LGAs with higher speed zones. These accidents displayed a higher serious and fatal injury rate</w:t>
-      </w:r>
-    </w:p>
-    <w:p>
-      <w:r>
         <w:rPr>
           <w:noProof/>
         </w:rPr>
-        <w:lastRenderedPageBreak/>
         <w:drawing>
           <wp:inline distT="0" distB="0" distL="0" distR="0" wp14:anchorId="521426B7" wp14:editId="4924B418">
             <wp:extent cx="5731510" cy="2588260"/>
@@ -723,26 +934,6 @@
     <w:p/>
     <w:p>
       <w:r>
-        <w:t>Q3 Insights: The top 5 LGAS by accident count reflect high-traffic urban arenas. The speed zone boxplots reveal the difference in road infrastructure while some LGAs have a mix of suburban and arterial roads while others cluster around lower speed limits in urban areas. The severity breakdown shows that despite having higher accident volumes, many of the LGAs maintain a lower proportion of serious and fatal crashes, this could be possible due to the lower speed environments and better roads. LGAs with higher speed zones tend to have more accidents that are serious or fatal. This is consistent with the relationship between vehicle speed and crash severity.</w:t>
-      </w:r>
-    </w:p>
-    <w:p/>
-    <w:p/>
-    <w:p/>
-    <w:p/>
-    <w:p/>
-    <w:p/>
-    <w:p/>
-    <w:p>
-      <w:pPr>
-        <w:rPr>
-          <w:b/>
-          <w:bCs/>
-        </w:rPr>
-      </w:pPr>
-    </w:p>
-    <w:p>
-      <w:r>
         <w:rPr>
           <w:b/>
           <w:bCs/>
@@ -752,14 +943,31 @@
     </w:p>
     <w:p>
       <w:r>
-        <w:t xml:space="preserve">The pandas development team. (2024). </w:t>
-      </w:r>
+        <w:t xml:space="preserve">The </w:t>
+      </w:r>
+      <w:proofErr w:type="gramStart"/>
+      <w:r>
+        <w:t>pandas</w:t>
+      </w:r>
+      <w:proofErr w:type="gramEnd"/>
+      <w:r>
+        <w:t xml:space="preserve"> development team. (2024). </w:t>
+      </w:r>
+      <w:proofErr w:type="gramStart"/>
       <w:r>
         <w:rPr>
           <w:i/>
           <w:iCs/>
         </w:rPr>
-        <w:t>pandas documentation</w:t>
+        <w:t>pandas</w:t>
+      </w:r>
+      <w:proofErr w:type="gramEnd"/>
+      <w:r>
+        <w:rPr>
+          <w:i/>
+          <w:iCs/>
+        </w:rPr>
+        <w:t xml:space="preserve"> documentation</w:t>
       </w:r>
       <w:r>
         <w:t xml:space="preserve">. </w:t>
@@ -821,7 +1029,6 @@
     </w:p>
     <w:p>
       <w:r>
-        <w:lastRenderedPageBreak/>
         <w:t xml:space="preserve">Waskom, M. L. (2021). seaborn: Statistical data visualization. </w:t>
       </w:r>
       <w:r>
@@ -829,7 +1036,23 @@
           <w:i/>
           <w:iCs/>
         </w:rPr>
-        <w:t>Journal of Open Source Software, 6</w:t>
+        <w:t xml:space="preserve">Journal of </w:t>
+      </w:r>
+      <w:proofErr w:type="gramStart"/>
+      <w:r>
+        <w:rPr>
+          <w:i/>
+          <w:iCs/>
+        </w:rPr>
+        <w:t>Open Source</w:t>
+      </w:r>
+      <w:proofErr w:type="gramEnd"/>
+      <w:r>
+        <w:rPr>
+          <w:i/>
+          <w:iCs/>
+        </w:rPr>
+        <w:t xml:space="preserve"> Software, 6</w:t>
       </w:r>
       <w:r>
         <w:t xml:space="preserve">(60), 3021. </w:t>
@@ -842,6 +1065,11 @@
           <w:t>https://doi.org/10.21105/joss.03021</w:t>
         </w:r>
       </w:hyperlink>
+    </w:p>
+    <w:p>
+      <w:r>
+        <w:t>Victorian road crash data</w:t>
+      </w:r>
     </w:p>
     <w:sectPr>
       <w:pgSz w:w="11906" w:h="16838"/>

</xml_diff>

<commit_message>
the final version of this assignment
</commit_message>
<xml_diff>
--- a/Assignment1/Assignment 1 Write Up.docx
+++ b/Assignment1/Assignment 1 Write Up.docx
@@ -317,7 +317,13 @@
         <w:t xml:space="preserve">Fixing Dirty Categories: </w:t>
       </w:r>
       <w:r>
-        <w:t xml:space="preserve">The DAY_OF_WEEK column had some ambiguous and unique values. Thursday was spelled as ‘Thu’ in some entries and ‘Weekend’ which is ambiguous as it could’ve been a Saturday or Sunday. I fixed up these errors by mapping ‘Thu’ to be seen as ‘Thursday’ and ‘Weekend’ to be seen as ‘Saturday’ as Saturday is the first weekend day and it’s safe to assume more people would be out and about than compared to Sunday. If I didn’t fix these issues the heatmap would’ve been incorrect. </w:t>
+        <w:t xml:space="preserve">The DAY_OF_WEEK column had some ambiguous and unique values. Thursday was spelled as ‘Thu’ in some entries and ‘Weekend’ which is ambiguous as it could’ve been a Saturday or Sunday. I fixed up these errors by mapping ‘Thu’ to be seen as ‘Thursday’ and ‘Weekend’ to be seen as </w:t>
+      </w:r>
+      <w:r>
+        <w:t>an unknown value</w:t>
+      </w:r>
+      <w:r>
+        <w:t xml:space="preserve">. If I didn’t fix these issues the heatmap would’ve been incorrect. </w:t>
       </w:r>
       <w:r>
         <w:t>LIGHT_CONDITION had ‘Unk.’ and ‘NO’ correctly mapped to ‘Unknown’ and ‘Days’ were mapped to ‘Day’ which allows it to match the category name</w:t>
@@ -505,10 +511,10 @@
     <w:p>
       <w:r>
         <w:drawing>
-          <wp:inline distT="0" distB="0" distL="0" distR="0" wp14:anchorId="1BA7C895" wp14:editId="195883A1">
+          <wp:inline distT="0" distB="0" distL="0" distR="0" wp14:anchorId="7BBF80DA" wp14:editId="274DA40F">
             <wp:extent cx="5731510" cy="1786890"/>
             <wp:effectExtent l="0" t="0" r="2540" b="3810"/>
-            <wp:docPr id="1491344229" name="Picture 1"/>
+            <wp:docPr id="24718020" name="Picture 1"/>
             <wp:cNvGraphicFramePr>
               <a:graphicFrameLocks xmlns:a="http://schemas.openxmlformats.org/drawingml/2006/main" noChangeAspect="1"/>
             </wp:cNvGraphicFramePr>
@@ -516,7 +522,7 @@
               <a:graphicData uri="http://schemas.openxmlformats.org/drawingml/2006/picture">
                 <pic:pic xmlns:pic="http://schemas.openxmlformats.org/drawingml/2006/picture">
                   <pic:nvPicPr>
-                    <pic:cNvPr id="1491344229" name=""/>
+                    <pic:cNvPr id="24718020" name=""/>
                     <pic:cNvPicPr/>
                   </pic:nvPicPr>
                   <pic:blipFill>
@@ -562,14 +568,11 @@
         <w:t xml:space="preserve"> a risk. </w:t>
       </w:r>
       <w:r>
-        <w:rPr>
-          <w:noProof/>
-        </w:rPr>
         <w:drawing>
-          <wp:inline distT="0" distB="0" distL="0" distR="0" wp14:anchorId="4DC29E2C" wp14:editId="79298731">
+          <wp:inline distT="0" distB="0" distL="0" distR="0" wp14:anchorId="623376F6" wp14:editId="540C38B9">
             <wp:extent cx="5731510" cy="1524635"/>
             <wp:effectExtent l="0" t="0" r="2540" b="0"/>
-            <wp:docPr id="2089475154" name="Picture 1"/>
+            <wp:docPr id="432628104" name="Picture 1"/>
             <wp:cNvGraphicFramePr>
               <a:graphicFrameLocks xmlns:a="http://schemas.openxmlformats.org/drawingml/2006/main" noChangeAspect="1"/>
             </wp:cNvGraphicFramePr>
@@ -577,7 +580,7 @@
               <a:graphicData uri="http://schemas.openxmlformats.org/drawingml/2006/picture">
                 <pic:pic xmlns:pic="http://schemas.openxmlformats.org/drawingml/2006/picture">
                   <pic:nvPicPr>
-                    <pic:cNvPr id="2089475154" name=""/>
+                    <pic:cNvPr id="432628104" name=""/>
                     <pic:cNvPicPr/>
                   </pic:nvPicPr>
                   <pic:blipFill>
@@ -617,10 +620,10 @@
           <w:noProof/>
         </w:rPr>
         <w:drawing>
-          <wp:inline distT="0" distB="0" distL="0" distR="0" wp14:anchorId="27CF5935" wp14:editId="760579B9">
+          <wp:inline distT="0" distB="0" distL="0" distR="0" wp14:anchorId="685D67B1" wp14:editId="43E94796">
             <wp:extent cx="5731510" cy="1826260"/>
             <wp:effectExtent l="0" t="0" r="2540" b="2540"/>
-            <wp:docPr id="1448212904" name="Picture 1"/>
+            <wp:docPr id="1697134675" name="Picture 1"/>
             <wp:cNvGraphicFramePr>
               <a:graphicFrameLocks xmlns:a="http://schemas.openxmlformats.org/drawingml/2006/main" noChangeAspect="1"/>
             </wp:cNvGraphicFramePr>
@@ -628,7 +631,7 @@
               <a:graphicData uri="http://schemas.openxmlformats.org/drawingml/2006/picture">
                 <pic:pic xmlns:pic="http://schemas.openxmlformats.org/drawingml/2006/picture">
                   <pic:nvPicPr>
-                    <pic:cNvPr id="1448212904" name=""/>
+                    <pic:cNvPr id="1697134675" name=""/>
                     <pic:cNvPicPr/>
                   </pic:nvPicPr>
                   <pic:blipFill>
@@ -669,11 +672,9 @@
       <w:r>
         <w:t xml:space="preserve">data. Serious Injury Accident and Other injury accident were the main types that were focused on. A KDE plot was used to </w:t>
       </w:r>
-      <w:proofErr w:type="gramStart"/>
-      <w:r>
-        <w:t>compare and contrast</w:t>
-      </w:r>
-      <w:proofErr w:type="gramEnd"/>
+      <w:r>
+        <w:t>compare</w:t>
+      </w:r>
       <w:r>
         <w:t xml:space="preserve"> the distribution of speeds zones between the severity categories. A histogram was considered but KDE beats it as it shows the distribution as a </w:t>
       </w:r>
@@ -686,23 +687,18 @@
       <w:r>
         <w:t>curve allowing for better analysing</w:t>
       </w:r>
-    </w:p>
-    <w:p>
-      <w:r>
-        <w:t xml:space="preserve">. </w:t>
-      </w:r>
-      <w:r>
-        <w:t xml:space="preserve"> </w:t>
-      </w:r>
-      <w:r>
-        <w:rPr>
-          <w:noProof/>
-        </w:rPr>
+      <w:r>
+        <w:t>.</w:t>
+      </w:r>
+    </w:p>
+    <w:p>
+      <w:r>
+        <w:lastRenderedPageBreak/>
         <w:drawing>
-          <wp:inline distT="0" distB="0" distL="0" distR="0" wp14:anchorId="16628D4C" wp14:editId="5DD362BE">
-            <wp:extent cx="3617843" cy="2295523"/>
-            <wp:effectExtent l="0" t="0" r="1905" b="0"/>
-            <wp:docPr id="1210283055" name="Picture 1"/>
+          <wp:inline distT="0" distB="0" distL="0" distR="0" wp14:anchorId="06B0E0C8" wp14:editId="485366D2">
+            <wp:extent cx="5731510" cy="3636645"/>
+            <wp:effectExtent l="0" t="0" r="2540" b="1905"/>
+            <wp:docPr id="122488389" name="Picture 1"/>
             <wp:cNvGraphicFramePr>
               <a:graphicFrameLocks xmlns:a="http://schemas.openxmlformats.org/drawingml/2006/main" noChangeAspect="1"/>
             </wp:cNvGraphicFramePr>
@@ -710,7 +706,7 @@
               <a:graphicData uri="http://schemas.openxmlformats.org/drawingml/2006/picture">
                 <pic:pic xmlns:pic="http://schemas.openxmlformats.org/drawingml/2006/picture">
                   <pic:nvPicPr>
-                    <pic:cNvPr id="1210283055" name=""/>
+                    <pic:cNvPr id="122488389" name=""/>
                     <pic:cNvPicPr/>
                   </pic:nvPicPr>
                   <pic:blipFill>
@@ -722,7 +718,7 @@
                   <pic:spPr>
                     <a:xfrm>
                       <a:off x="0" y="0"/>
-                      <a:ext cx="3623361" cy="2299024"/>
+                      <a:ext cx="5731510" cy="3636645"/>
                     </a:xfrm>
                     <a:prstGeom prst="rect">
                       <a:avLst/>
@@ -737,7 +733,6 @@
     </w:p>
     <w:p>
       <w:r>
-        <w:lastRenderedPageBreak/>
         <w:t xml:space="preserve">A Bar chart was also used to show the major question of if higher speed zones lead to more victims per accident. </w:t>
       </w:r>
       <w:proofErr w:type="spellStart"/>
@@ -780,10 +775,10 @@
     <w:p>
       <w:r>
         <w:drawing>
-          <wp:inline distT="0" distB="0" distL="0" distR="0" wp14:anchorId="7B29FBFB" wp14:editId="406E4A30">
-            <wp:extent cx="5731510" cy="3692525"/>
-            <wp:effectExtent l="0" t="0" r="2540" b="3175"/>
-            <wp:docPr id="1251103427" name="Picture 1"/>
+          <wp:inline distT="0" distB="0" distL="0" distR="0" wp14:anchorId="4E7BCEF7" wp14:editId="54821447">
+            <wp:extent cx="5731510" cy="3419475"/>
+            <wp:effectExtent l="0" t="0" r="2540" b="9525"/>
+            <wp:docPr id="1554208863" name="Picture 1"/>
             <wp:cNvGraphicFramePr>
               <a:graphicFrameLocks xmlns:a="http://schemas.openxmlformats.org/drawingml/2006/main" noChangeAspect="1"/>
             </wp:cNvGraphicFramePr>
@@ -791,7 +786,7 @@
               <a:graphicData uri="http://schemas.openxmlformats.org/drawingml/2006/picture">
                 <pic:pic xmlns:pic="http://schemas.openxmlformats.org/drawingml/2006/picture">
                   <pic:nvPicPr>
-                    <pic:cNvPr id="1251103427" name=""/>
+                    <pic:cNvPr id="1554208863" name=""/>
                     <pic:cNvPicPr/>
                   </pic:nvPicPr>
                   <pic:blipFill>
@@ -803,7 +798,7 @@
                   <pic:spPr>
                     <a:xfrm>
                       <a:off x="0" y="0"/>
-                      <a:ext cx="5731510" cy="3692525"/>
+                      <a:ext cx="5731510" cy="3419475"/>
                     </a:xfrm>
                     <a:prstGeom prst="rect">
                       <a:avLst/>
@@ -817,8 +812,10 @@
       </w:r>
     </w:p>
     <w:p/>
-    <w:p>
-      <w:r>
+    <w:p/>
+    <w:p>
+      <w:r>
+        <w:lastRenderedPageBreak/>
         <w:t>Q3</w:t>
       </w:r>
     </w:p>
@@ -850,7 +847,6 @@
         <w:rPr>
           <w:noProof/>
         </w:rPr>
-        <w:lastRenderedPageBreak/>
         <w:drawing>
           <wp:inline distT="0" distB="0" distL="0" distR="0" wp14:anchorId="5495DEAA" wp14:editId="65F0B73F">
             <wp:extent cx="5731510" cy="2578735"/>
@@ -932,6 +928,38 @@
       </w:r>
     </w:p>
     <w:p/>
+    <w:p>
+      <w:pPr>
+        <w:rPr>
+          <w:b/>
+          <w:bCs/>
+        </w:rPr>
+      </w:pPr>
+    </w:p>
+    <w:p>
+      <w:pPr>
+        <w:rPr>
+          <w:b/>
+          <w:bCs/>
+        </w:rPr>
+      </w:pPr>
+    </w:p>
+    <w:p>
+      <w:pPr>
+        <w:rPr>
+          <w:b/>
+          <w:bCs/>
+        </w:rPr>
+      </w:pPr>
+    </w:p>
+    <w:p>
+      <w:pPr>
+        <w:rPr>
+          <w:b/>
+          <w:bCs/>
+        </w:rPr>
+      </w:pPr>
+    </w:p>
     <w:p>
       <w:r>
         <w:rPr>
@@ -2298,6 +2326,7 @@
   <w:style w:type="character" w:default="1" w:styleId="DefaultParagraphFont">
     <w:name w:val="Default Paragraph Font"/>
     <w:uiPriority w:val="1"/>
+    <w:semiHidden/>
     <w:unhideWhenUsed/>
   </w:style>
   <w:style w:type="table" w:default="1" w:styleId="TableNormal">

</xml_diff>

<commit_message>
did some more changes and it should be finished now
</commit_message>
<xml_diff>
--- a/Assignment1/Assignment 1 Write Up.docx
+++ b/Assignment1/Assignment 1 Write Up.docx
@@ -461,7 +461,13 @@
     <w:p/>
     <w:p>
       <w:r>
-        <w:t xml:space="preserve">The data was meant to be filtered to only 2023. ACCIDENT_TIME was reparsed with the </w:t>
+        <w:t>The data was filtered to only 2023</w:t>
+      </w:r>
+      <w:r>
+        <w:t xml:space="preserve"> data</w:t>
+      </w:r>
+      <w:r>
+        <w:t xml:space="preserve">. ACCIDENT_TIME was reparsed with the </w:t>
       </w:r>
       <w:proofErr w:type="spellStart"/>
       <w:r>
@@ -489,29 +495,12 @@
       <w:r>
         <w:t xml:space="preserve"> wasn’t used. </w:t>
       </w:r>
-    </w:p>
-    <w:p>
-      <w:pPr>
+      <w:r>
         <w:rPr>
           <w:noProof/>
         </w:rPr>
-      </w:pPr>
-      <w:r>
-        <w:t xml:space="preserve">A heatmap was made so we can see accidents grouped DAY_OF_WEEK, HOUR and count. Days were indexed in the correct order (Monday to Sunday). Hour labels were then converted to 12-hour format so AM and PM is used to readability. The heatmap uses a </w:t>
-      </w:r>
-      <w:proofErr w:type="spellStart"/>
-      <w:r>
-        <w:t>YlOrRd</w:t>
-      </w:r>
-      <w:proofErr w:type="spellEnd"/>
-      <w:r>
-        <w:t xml:space="preserve"> colour scale to display how many accidents. 3PM on weekdays were the most highly dense parts of the heatmap as many people are picking up children from school while it is slightly elevated on Friday and Saturday nights. </w:t>
-      </w:r>
-    </w:p>
-    <w:p>
-      <w:r>
         <w:drawing>
-          <wp:inline distT="0" distB="0" distL="0" distR="0" wp14:anchorId="7BBF80DA" wp14:editId="274DA40F">
+          <wp:inline distT="0" distB="0" distL="0" distR="0" wp14:anchorId="3E266BE3" wp14:editId="165420F7">
             <wp:extent cx="5731510" cy="1786890"/>
             <wp:effectExtent l="0" t="0" r="2540" b="3810"/>
             <wp:docPr id="24718020" name="Picture 1"/>
@@ -547,12 +536,57 @@
         </w:drawing>
       </w:r>
     </w:p>
+    <w:p>
+      <w:pPr>
+        <w:rPr>
+          <w:noProof/>
+        </w:rPr>
+      </w:pPr>
+      <w:r>
+        <w:t xml:space="preserve">A heatmap was made so we can see accidents grouped DAY_OF_WEEK, HOUR and count. Days were indexed in the correct order (Monday to Sunday). Hour labels were then converted to 12-hour format </w:t>
+      </w:r>
+      <w:r>
+        <w:t xml:space="preserve">for better </w:t>
+      </w:r>
+      <w:r>
+        <w:t xml:space="preserve">readability. The heatmap uses a </w:t>
+      </w:r>
+      <w:proofErr w:type="spellStart"/>
+      <w:r>
+        <w:t>YlOrRd</w:t>
+      </w:r>
+      <w:proofErr w:type="spellEnd"/>
+      <w:r>
+        <w:t xml:space="preserve"> colour scale to display how many accidents. </w:t>
+      </w:r>
+      <w:r>
+        <w:t xml:space="preserve">The graph displays that </w:t>
+      </w:r>
+      <w:r>
+        <w:t xml:space="preserve">3PM on weekdays were the most highly dense </w:t>
+      </w:r>
+      <w:r>
+        <w:t>and</w:t>
+      </w:r>
+      <w:r>
+        <w:t xml:space="preserve"> </w:t>
+      </w:r>
+      <w:r>
+        <w:t xml:space="preserve">darker coloured </w:t>
+      </w:r>
+      <w:r>
+        <w:t>parts of the heatmap as many people are picking up children from school while it is slightly elevated on Friday and Saturday nights</w:t>
+      </w:r>
+      <w:r>
+        <w:t xml:space="preserve"> due to people being out and about with their family or friends.</w:t>
+      </w:r>
+    </w:p>
     <w:p/>
     <w:p/>
     <w:p/>
-    <w:p>
-      <w:r>
-        <w:lastRenderedPageBreak/>
+    <w:p/>
+    <w:p>
+      <w:r>
         <w:t xml:space="preserve">A line chart was also made to show the accidents grouped by hour and light conditions. The major finding with this chart was that daytime accidents dominate in raw numbers </w:t>
       </w:r>
       <w:r>
@@ -568,6 +602,9 @@
         <w:t xml:space="preserve"> a risk. </w:t>
       </w:r>
       <w:r>
+        <w:rPr>
+          <w:noProof/>
+        </w:rPr>
         <w:drawing>
           <wp:inline distT="0" distB="0" distL="0" distR="0" wp14:anchorId="623376F6" wp14:editId="540C38B9">
             <wp:extent cx="5731510" cy="1524635"/>
@@ -659,43 +696,21 @@
     <w:p/>
     <w:p>
       <w:r>
+        <w:lastRenderedPageBreak/>
         <w:t>Q2:</w:t>
       </w:r>
-    </w:p>
-    <w:p>
-      <w:r>
+      <w:r>
+        <w:rPr>
+          <w:noProof/>
+        </w:rPr>
         <w:t xml:space="preserve"> </w:t>
       </w:r>
       <w:r>
-        <w:t xml:space="preserve">A KDE plot was created to compare the distribution of speed zone </w:t>
-      </w:r>
-      <w:r>
-        <w:t xml:space="preserve">data. Serious Injury Accident and Other injury accident were the main types that were focused on. A KDE plot was used to </w:t>
-      </w:r>
-      <w:r>
-        <w:t>compare</w:t>
-      </w:r>
-      <w:r>
-        <w:t xml:space="preserve"> the distribution of speeds zones between the severity categories. A histogram was considered but KDE beats it as it shows the distribution as a </w:t>
-      </w:r>
-      <w:r>
-        <w:t>smooth</w:t>
-      </w:r>
-      <w:r>
-        <w:t xml:space="preserve"> </w:t>
-      </w:r>
-      <w:r>
-        <w:t>curve allowing for better analysing</w:t>
-      </w:r>
-      <w:r>
-        <w:t>.</w:t>
-      </w:r>
-    </w:p>
-    <w:p>
-      <w:r>
-        <w:lastRenderedPageBreak/>
+        <w:rPr>
+          <w:noProof/>
+        </w:rPr>
         <w:drawing>
-          <wp:inline distT="0" distB="0" distL="0" distR="0" wp14:anchorId="06B0E0C8" wp14:editId="485366D2">
+          <wp:inline distT="0" distB="0" distL="0" distR="0" wp14:anchorId="18CB29BA" wp14:editId="57997E51">
             <wp:extent cx="5731510" cy="3636645"/>
             <wp:effectExtent l="0" t="0" r="2540" b="1905"/>
             <wp:docPr id="122488389" name="Picture 1"/>
@@ -733,47 +748,39 @@
     </w:p>
     <w:p>
       <w:r>
-        <w:t xml:space="preserve">A Bar chart was also used to show the major question of if higher speed zones lead to more victims per accident. </w:t>
-      </w:r>
-      <w:proofErr w:type="spellStart"/>
-      <w:proofErr w:type="gramStart"/>
-      <w:r>
-        <w:t>n</w:t>
-      </w:r>
-      <w:r>
-        <w:t>p.mean</w:t>
-      </w:r>
-      <w:proofErr w:type="spellEnd"/>
-      <w:proofErr w:type="gramEnd"/>
-      <w:r>
-        <w:t xml:space="preserve"> was used as the estimator while using </w:t>
-      </w:r>
-      <w:proofErr w:type="spellStart"/>
-      <w:r>
-        <w:t>seaborn’s</w:t>
-      </w:r>
-      <w:proofErr w:type="spellEnd"/>
-      <w:r>
         <w:t xml:space="preserve"> </w:t>
       </w:r>
       <w:r>
-        <w:t>bar plot</w:t>
-      </w:r>
-      <w:r>
-        <w:t xml:space="preserve">. </w:t>
-      </w:r>
-      <w:r>
-        <w:t>It answers that higher speed zones do correlate with more victims per accidents and is consistent with the know</w:t>
-      </w:r>
-      <w:r>
-        <w:t>n</w:t>
-      </w:r>
-      <w:r>
-        <w:t xml:space="preserve"> relationship between vehicle speed and crash severity. </w:t>
-      </w:r>
-    </w:p>
-    <w:p>
-      <w:r>
+        <w:t xml:space="preserve">A KDE plot was created to compare the distribution of speed zone </w:t>
+      </w:r>
+      <w:r>
+        <w:t xml:space="preserve">data. Serious Injury Accident and Other injury accident were the main types that were focused on. A KDE plot was used to </w:t>
+      </w:r>
+      <w:r>
+        <w:t>compare</w:t>
+      </w:r>
+      <w:r>
+        <w:t xml:space="preserve"> the distribution of speeds zones between the severity categories. A histogram was considered but KDE beats it as it shows the distribution as a </w:t>
+      </w:r>
+      <w:r>
+        <w:t>smooth</w:t>
+      </w:r>
+      <w:r>
+        <w:t xml:space="preserve"> </w:t>
+      </w:r>
+      <w:r>
+        <w:t>curve allowing for better analysing</w:t>
+      </w:r>
+      <w:r>
+        <w:t>.</w:t>
+      </w:r>
+    </w:p>
+    <w:p/>
+    <w:p>
+      <w:r>
+        <w:rPr>
+          <w:noProof/>
+        </w:rPr>
         <w:drawing>
           <wp:inline distT="0" distB="0" distL="0" distR="0" wp14:anchorId="4E7BCEF7" wp14:editId="54821447">
             <wp:extent cx="5731510" cy="3419475"/>
@@ -811,35 +818,48 @@
         </w:drawing>
       </w:r>
     </w:p>
+    <w:p>
+      <w:r>
+        <w:lastRenderedPageBreak/>
+        <w:t xml:space="preserve">A Bar chart was also used to show the major question of if higher speed zones lead to more victims per accident. </w:t>
+      </w:r>
+      <w:proofErr w:type="spellStart"/>
+      <w:proofErr w:type="gramStart"/>
+      <w:r>
+        <w:t>np.mean</w:t>
+      </w:r>
+      <w:proofErr w:type="spellEnd"/>
+      <w:proofErr w:type="gramEnd"/>
+      <w:r>
+        <w:t xml:space="preserve"> was used as the estimator while using </w:t>
+      </w:r>
+      <w:proofErr w:type="spellStart"/>
+      <w:r>
+        <w:t>seaborn’s</w:t>
+      </w:r>
+      <w:proofErr w:type="spellEnd"/>
+      <w:r>
+        <w:t xml:space="preserve"> bar plot. It answers that higher speed zones do correlate with more victims per accidents and is consistent with the known relationship between vehicle speed and crash severity. </w:t>
+      </w:r>
+    </w:p>
     <w:p/>
     <w:p/>
     <w:p>
       <w:r>
-        <w:lastRenderedPageBreak/>
         <w:t>Q3</w:t>
       </w:r>
-    </w:p>
-    <w:p>
-      <w:r>
-        <w:t xml:space="preserve">The top 5 LGAS by accident count reflect high-traffic urban areas. The speed zone boxplots </w:t>
-      </w:r>
-      <w:r>
-        <w:t xml:space="preserve">were the most ideal graph to use as it shows the median, IQR and outliers in parallel. This </w:t>
-      </w:r>
-      <w:r>
-        <w:t>reveal</w:t>
-      </w:r>
-      <w:r>
-        <w:t>s</w:t>
-      </w:r>
-      <w:r>
-        <w:t xml:space="preserve"> the difference in road infrastructure while some LGAs have a mix of suburban and arterial roads while others cluster around lower speed limits in urban areas. The severity breakdown</w:t>
-      </w:r>
-      <w:r>
-        <w:t xml:space="preserve"> was visualized by a stacked bar chart with the LGAs grouped by different accident counts. The chart</w:t>
-      </w:r>
-      <w:r>
-        <w:t xml:space="preserve"> shows that despite having higher accident volumes, many of the LGAs maintain a lower proportion of serious and fatal crashes, this could be possible due to the lower speed environments and better roads. LGAs with higher speed zones tend to have more accidents that are serious or fatal. This is consistent with the relationship between vehicle speed and crash severity.</w:t>
+      <w:r>
+        <w:t>:</w:t>
+      </w:r>
+    </w:p>
+    <w:p>
+      <w:r>
+        <w:t xml:space="preserve">Looking at the top 5 LGAs, Melbourne stands out. This is due to its speed zones being enforced to around 50km/hr which paints the picture that the city is full of residential streets and intersections. Hume, Casey and Dandenong are different due to their speed zones being more spread and higher than Melbourne, this reflects that highways and freeways cut through these areas. </w:t>
+      </w:r>
+    </w:p>
+    <w:p>
+      <w:r>
+        <w:t xml:space="preserve">The difference in the road type also tells us more about how more severe the crashes can be too. Geelong and Dandenong have a higher proportion of serious injuries when compared to Melbourne. Melbourne however has an accident more frequently but many of those are seen as minor crashes due to the lower speed zones lessening the chance of fatal or serious injuries. In contrast areas like Dandenong and Hume tend to have a high ratio of fatal injuries due to speed and how drivers have a lessen amount of time to react.  </w:t>
       </w:r>
     </w:p>
     <w:p>
@@ -890,6 +910,7 @@
         <w:rPr>
           <w:noProof/>
         </w:rPr>
+        <w:lastRenderedPageBreak/>
         <w:drawing>
           <wp:inline distT="0" distB="0" distL="0" distR="0" wp14:anchorId="521426B7" wp14:editId="4924B418">
             <wp:extent cx="5731510" cy="2588260"/>
@@ -2326,7 +2347,6 @@
   <w:style w:type="character" w:default="1" w:styleId="DefaultParagraphFont">
     <w:name w:val="Default Paragraph Font"/>
     <w:uiPriority w:val="1"/>
-    <w:semiHidden/>
     <w:unhideWhenUsed/>
   </w:style>
   <w:style w:type="table" w:default="1" w:styleId="TableNormal">

</xml_diff>